<commit_message>
Design system v3.2: remaining audit items
- Diagrams: ConceptWeb, CycleDiagram and Pyramid switch to a list of the
  same structure below 600px of container width (labels never under
  12px; also the screen-reader view); checker flags labels too long.
- Antes de leer: ThinkFurther takes 'revisit'; checker warns when a unit
  has no opening questions or never returns to them; template updated.
- Automatic references: Bibliography (book/article/chapter/web, suffixes,
  group authors), Cite by id, ReferencesBox auto, APA order with a/b
  suffixes; referenceText() for non-React use.
- Checker cross-checks citations against the reference list (React,
  HTML and Word): cited-but-missing is an error, uncited a warning.
- Word files: paragraph borders reordered to the OOXML schema order
  (docx 9.7.1 writes them out of order); both files validate.
- 25 tests.

Co-Authored-By: Claude Opus 5.5 <noreply@anthropic.com>
Claude-Session: https://claude.ai/code/session_01KgMbfgSvaGR8xP6R2cYBnE
</commit_message>
<xml_diff>
--- a/didactica-design-system/templates/Didactica-Universitaria-muestra.docx
+++ b/didactica-design-system/templates/Didactica-Universitaria-muestra.docx
@@ -194,7 +194,17 @@
         <w:t xml:space="preserve">Puntos Clave</w:t>
       </w:r>
       <w:r>
-        <w:t xml:space="preserve"> (3 a 5 ideas de una línea) y, si lo desea, preguntas “Antes de leer”.</w:t>
+        <w:t xml:space="preserve"> (3 a 5 ideas de una línea) con 1 a 3 preguntas “Antes de leer”, que se retoman en </w:t>
+      </w:r>
+      <w:r>
+        <w:rPr>
+          <w:b/>
+          <w:bCs/>
+        </w:rPr>
+        <w:t xml:space="preserve">Para Seguir Pensando</w:t>
+      </w:r>
+      <w:r>
+        <w:t xml:space="preserve">.</w:t>
       </w:r>
     </w:p>
     <w:p>
@@ -2171,6 +2181,44 @@
               <w:t xml:space="preserve">[Pregunta abierta que conecte la unidad con la práctica.]</w:t>
             </w:r>
           </w:p>
+          <w:p>
+            <w:pPr>
+              <w:pStyle w:val="RecuadroTexto"/>
+              <w:keepNext/>
+              <w:spacing w:before="120"/>
+            </w:pPr>
+            <w:r>
+              <w:rPr>
+                <w:rFonts w:ascii="Calibri" w:cs="Calibri" w:eastAsia="Calibri" w:hAnsi="Calibri"/>
+                <w:b/>
+                <w:bCs/>
+                <w:color w:val="5A3486"/>
+              </w:rPr>
+              <w:t xml:space="preserve">Vuelva a las preguntas del comienzo:</w:t>
+            </w:r>
+          </w:p>
+          <w:p>
+            <w:pPr>
+              <w:pStyle w:val="RecuadroTexto"/>
+              <w:keepNext/>
+            </w:pPr>
+            <w:r>
+              <w:t xml:space="preserve">[Repita aquí las preguntas “Antes de leer”.]</w:t>
+            </w:r>
+          </w:p>
+          <w:p>
+            <w:pPr>
+              <w:pStyle w:val="RecuadroTexto"/>
+              <w:keepNext/>
+            </w:pPr>
+            <w:r>
+              <w:rPr>
+                <w:i/>
+                <w:iCs/>
+              </w:rPr>
+              <w:t xml:space="preserve">¿Respondería hoy lo mismo que antes de leer la unidad? ¿Qué cambió y por qué?</w:t>
+            </w:r>
+          </w:p>
         </w:tc>
       </w:tr>
     </w:tbl>
@@ -2855,6 +2903,31 @@
               <w:t xml:space="preserve">[Punto clave.]</w:t>
             </w:r>
           </w:p>
+          <w:p>
+            <w:pPr>
+              <w:pStyle w:val="RecuadroTexto"/>
+              <w:keepNext/>
+              <w:spacing w:before="120"/>
+            </w:pPr>
+            <w:r>
+              <w:rPr>
+                <w:rFonts w:ascii="Calibri" w:cs="Calibri" w:eastAsia="Calibri" w:hAnsi="Calibri"/>
+                <w:b/>
+                <w:bCs/>
+                <w:color w:val="1F3864"/>
+              </w:rPr>
+              <w:t xml:space="preserve">Antes de leer:</w:t>
+            </w:r>
+          </w:p>
+          <w:p>
+            <w:pPr>
+              <w:pStyle w:val="RecuadroTexto"/>
+              <w:keepNext/>
+            </w:pPr>
+            <w:r>
+              <w:t xml:space="preserve">[¿Pregunta para anticipar el contenido?]</w:t>
+            </w:r>
+          </w:p>
         </w:tc>
       </w:tr>
     </w:tbl>
@@ -3627,6 +3700,31 @@
             </w:pPr>
             <w:r>
               <w:t xml:space="preserve">[Pregunta abierta.]</w:t>
+            </w:r>
+          </w:p>
+          <w:p>
+            <w:pPr>
+              <w:pStyle w:val="RecuadroTexto"/>
+              <w:keepNext/>
+              <w:spacing w:before="120"/>
+            </w:pPr>
+            <w:r>
+              <w:rPr>
+                <w:rFonts w:ascii="Calibri" w:cs="Calibri" w:eastAsia="Calibri" w:hAnsi="Calibri"/>
+                <w:b/>
+                <w:bCs/>
+                <w:color w:val="5A3486"/>
+              </w:rPr>
+              <w:t xml:space="preserve">Vuelva a las preguntas del comienzo:</w:t>
+            </w:r>
+          </w:p>
+          <w:p>
+            <w:pPr>
+              <w:pStyle w:val="RecuadroTexto"/>
+              <w:keepNext/>
+            </w:pPr>
+            <w:r>
+              <w:t xml:space="preserve">[Preguntas “Antes de leer”.]</w:t>
             </w:r>
           </w:p>
         </w:tc>
@@ -5709,10 +5807,11 @@
     <w:next w:val="Normal"/>
     <w:qFormat/>
     <w:pPr>
+      <w:keepNext/>
       <w:pBdr>
         <w:top w:val="dashed" w:color="6F7F99" w:sz="6" w:space="12"/>
+        <w:left w:val="dashed" w:color="6F7F99" w:sz="6" w:space="12"/>
         <w:bottom w:val="dashed" w:color="6F7F99" w:sz="6" w:space="12"/>
-        <w:left w:val="dashed" w:color="6F7F99" w:sz="6" w:space="12"/>
         <w:right w:val="dashed" w:color="6F7F99" w:sz="6" w:space="12"/>
       </w:pBdr>
       <w:spacing w:after="120" w:before="120"/>

</xml_diff>

<commit_message>
Design system v3.3: table header colour and twelve new diagram types
- Tables: header row on its own table-head-surface token; one colour per
  body row (paper / band); row headers keep their row's colour and use
  bold navy sans, so header, first column and stripes no longer mix.
  The Word template uses the same fills.
- Diagrams: TreeDiagram, ConceptMap, MindMap, VennDiagram,
  QuadrantMatrix, Timeline, Fishbone, Spectrum, Funnel, Staircase,
  NestedCircles and Iceberg, each with the list fallback below 600px.
- Example gallery with manual content, component metadata, typings,
  previews, a render test, and README guidance on which diagram fits
  which information.

Co-Authored-By: Claude Opus 5.5 <noreply@anthropic.com>
Claude-Session: https://claude.ai/code/session_01KgMbfgSvaGR8xP6R2cYBnE
</commit_message>
<xml_diff>
--- a/didactica-design-system/templates/Didactica-Universitaria-muestra.docx
+++ b/didactica-design-system/templates/Didactica-Universitaria-muestra.docx
@@ -557,7 +557,7 @@
               <w:bottom w:val="single" w:color="6F7F99" w:sz="12"/>
               <w:right w:val="none" w:color="FFFFFF" w:sz="0"/>
             </w:tcBorders>
-            <w:shd w:fill="F2F5FA" w:color="auto" w:val="clear"/>
+            <w:shd w:fill="C8D4EA" w:color="auto" w:val="clear"/>
             <w:tcMar>
               <w:top w:type="dxa" w:w="80"/>
               <w:left w:type="dxa" w:w="120"/>
@@ -583,7 +583,7 @@
               <w:bottom w:val="single" w:color="6F7F99" w:sz="12"/>
               <w:right w:val="none" w:color="FFFFFF" w:sz="0"/>
             </w:tcBorders>
-            <w:shd w:fill="F2F5FA" w:color="auto" w:val="clear"/>
+            <w:shd w:fill="C8D4EA" w:color="auto" w:val="clear"/>
             <w:tcMar>
               <w:top w:type="dxa" w:w="80"/>
               <w:left w:type="dxa" w:w="120"/>
@@ -609,7 +609,7 @@
               <w:bottom w:val="single" w:color="6F7F99" w:sz="12"/>
               <w:right w:val="none" w:color="FFFFFF" w:sz="0"/>
             </w:tcBorders>
-            <w:shd w:fill="F2F5FA" w:color="auto" w:val="clear"/>
+            <w:shd w:fill="C8D4EA" w:color="auto" w:val="clear"/>
             <w:tcMar>
               <w:top w:type="dxa" w:w="80"/>
               <w:left w:type="dxa" w:w="120"/>
@@ -3236,7 +3236,7 @@
               <w:bottom w:val="single" w:color="6F7F99" w:sz="12"/>
               <w:right w:val="none" w:color="FFFFFF" w:sz="0"/>
             </w:tcBorders>
-            <w:shd w:fill="F2F5FA" w:color="auto" w:val="clear"/>
+            <w:shd w:fill="C8D4EA" w:color="auto" w:val="clear"/>
             <w:tcMar>
               <w:top w:type="dxa" w:w="80"/>
               <w:left w:type="dxa" w:w="120"/>
@@ -3262,7 +3262,7 @@
               <w:bottom w:val="single" w:color="6F7F99" w:sz="12"/>
               <w:right w:val="none" w:color="FFFFFF" w:sz="0"/>
             </w:tcBorders>
-            <w:shd w:fill="F2F5FA" w:color="auto" w:val="clear"/>
+            <w:shd w:fill="C8D4EA" w:color="auto" w:val="clear"/>
             <w:tcMar>
               <w:top w:type="dxa" w:w="80"/>
               <w:left w:type="dxa" w:w="120"/>
@@ -3288,7 +3288,7 @@
               <w:bottom w:val="single" w:color="6F7F99" w:sz="12"/>
               <w:right w:val="none" w:color="FFFFFF" w:sz="0"/>
             </w:tcBorders>
-            <w:shd w:fill="F2F5FA" w:color="auto" w:val="clear"/>
+            <w:shd w:fill="C8D4EA" w:color="auto" w:val="clear"/>
             <w:tcMar>
               <w:top w:type="dxa" w:w="80"/>
               <w:left w:type="dxa" w:w="120"/>
@@ -3319,7 +3319,6 @@
               <w:bottom w:val="single" w:color="C3CDE0" w:sz="4"/>
               <w:right w:val="none" w:color="FFFFFF" w:sz="0"/>
             </w:tcBorders>
-            <w:shd w:fill="F2F5FA" w:color="auto" w:val="clear"/>
             <w:tcMar>
               <w:top w:type="dxa" w:w="60"/>
               <w:left w:type="dxa" w:w="120"/>
@@ -3483,7 +3482,6 @@
               <w:bottom w:val="single" w:color="6F7F99" w:sz="12"/>
               <w:right w:val="none" w:color="FFFFFF" w:sz="0"/>
             </w:tcBorders>
-            <w:shd w:fill="F2F5FA" w:color="auto" w:val="clear"/>
             <w:tcMar>
               <w:top w:type="dxa" w:w="60"/>
               <w:left w:type="dxa" w:w="120"/>
@@ -4082,7 +4080,7 @@
               <w:bottom w:val="single" w:color="6F7F99" w:sz="12"/>
               <w:right w:val="none" w:color="FFFFFF" w:sz="0"/>
             </w:tcBorders>
-            <w:shd w:fill="F2F5FA" w:color="auto" w:val="clear"/>
+            <w:shd w:fill="C8D4EA" w:color="auto" w:val="clear"/>
             <w:tcMar>
               <w:top w:type="dxa" w:w="80"/>
               <w:left w:type="dxa" w:w="120"/>
@@ -4108,7 +4106,7 @@
               <w:bottom w:val="single" w:color="6F7F99" w:sz="12"/>
               <w:right w:val="none" w:color="FFFFFF" w:sz="0"/>
             </w:tcBorders>
-            <w:shd w:fill="F2F5FA" w:color="auto" w:val="clear"/>
+            <w:shd w:fill="C8D4EA" w:color="auto" w:val="clear"/>
             <w:tcMar>
               <w:top w:type="dxa" w:w="80"/>
               <w:left w:type="dxa" w:w="120"/>
@@ -4134,7 +4132,7 @@
               <w:bottom w:val="single" w:color="6F7F99" w:sz="12"/>
               <w:right w:val="none" w:color="FFFFFF" w:sz="0"/>
             </w:tcBorders>
-            <w:shd w:fill="F2F5FA" w:color="auto" w:val="clear"/>
+            <w:shd w:fill="C8D4EA" w:color="auto" w:val="clear"/>
             <w:tcMar>
               <w:top w:type="dxa" w:w="80"/>
               <w:left w:type="dxa" w:w="120"/>
@@ -4160,7 +4158,7 @@
               <w:bottom w:val="single" w:color="6F7F99" w:sz="12"/>
               <w:right w:val="none" w:color="FFFFFF" w:sz="0"/>
             </w:tcBorders>
-            <w:shd w:fill="F2F5FA" w:color="auto" w:val="clear"/>
+            <w:shd w:fill="C8D4EA" w:color="auto" w:val="clear"/>
             <w:tcMar>
               <w:top w:type="dxa" w:w="80"/>
               <w:left w:type="dxa" w:w="120"/>
@@ -4191,7 +4189,6 @@
               <w:bottom w:val="single" w:color="C3CDE0" w:sz="4"/>
               <w:right w:val="none" w:color="FFFFFF" w:sz="0"/>
             </w:tcBorders>
-            <w:shd w:fill="F2F5FA" w:color="auto" w:val="clear"/>
             <w:tcMar>
               <w:top w:type="dxa" w:w="60"/>
               <w:left w:type="dxa" w:w="120"/>

</xml_diff>

<commit_message>
Print on A4 or Letter portrait; Playwright as a dev dependency
- Print takes whichever portrait paper the printer uses, with 2.54cm
  margins like the Word template, so diagrams print at the full text
  width (labels 12.4px on A4, 12.8px on Letter). Each screen sheet
  starts a new sheet of paper, a chapter that opens a sheet stays with
  its running header, pages are numbered in the bottom margin (not the
  cover), and the screen-only "Página N" footers are left out. The
  demo's theme button and grey background no longer print.
- Word template: the box and table text block is now 6.27in (A4 minus
  two 1in margins), so boxes and tables stay inside the margins on A4
  as well as Letter.
- Playwright 1.61.0 is a dev dependency, pinned to the installed
  Chromium build 1228; check-diagrams no longer needs a manual install.
- seed.sql carries the new diagram summaries from v3.4.

Co-Authored-By: Claude Opus 5.5 <noreply@anthropic.com>
</commit_message>
<xml_diff>
--- a/didactica-design-system/templates/Didactica-Universitaria-muestra.docx
+++ b/didactica-design-system/templates/Didactica-Universitaria-muestra.docx
@@ -528,7 +528,7 @@
     </w:p>
     <w:tbl>
       <w:tblPr>
-        <w:tblW w:type="dxa" w:w="9360"/>
+        <w:tblW w:type="dxa" w:w="9026"/>
         <w:tblBorders>
           <w:top w:val="single" w:color="auto" w:sz="4"/>
           <w:left w:val="single" w:color="auto" w:sz="4"/>
@@ -540,9 +540,9 @@
         <w:tblLayout w:type="fixed"/>
       </w:tblPr>
       <w:tblGrid>
-        <w:gridCol w:w="936"/>
-        <w:gridCol w:w="1872"/>
-        <w:gridCol w:w="6552"/>
+        <w:gridCol w:w="903"/>
+        <w:gridCol w:w="1805"/>
+        <w:gridCol w:w="6318"/>
       </w:tblGrid>
       <w:tr>
         <w:trPr>
@@ -550,7 +550,7 @@
         </w:trPr>
         <w:tc>
           <w:tcPr>
-            <w:tcW w:type="dxa" w:w="936"/>
+            <w:tcW w:type="dxa" w:w="903"/>
             <w:tcBorders>
               <w:top w:val="single" w:color="6F7F99" w:sz="12"/>
               <w:left w:val="none" w:color="FFFFFF" w:sz="0"/>
@@ -576,7 +576,7 @@
         </w:tc>
         <w:tc>
           <w:tcPr>
-            <w:tcW w:type="dxa" w:w="1872"/>
+            <w:tcW w:type="dxa" w:w="1805"/>
             <w:tcBorders>
               <w:top w:val="single" w:color="6F7F99" w:sz="12"/>
               <w:left w:val="none" w:color="FFFFFF" w:sz="0"/>
@@ -602,7 +602,7 @@
         </w:tc>
         <w:tc>
           <w:tcPr>
-            <w:tcW w:type="dxa" w:w="6552"/>
+            <w:tcW w:type="dxa" w:w="6318"/>
             <w:tcBorders>
               <w:top w:val="single" w:color="6F7F99" w:sz="12"/>
               <w:left w:val="none" w:color="FFFFFF" w:sz="0"/>
@@ -633,7 +633,7 @@
         </w:trPr>
         <w:tc>
           <w:tcPr>
-            <w:tcW w:type="dxa" w:w="936"/>
+            <w:tcW w:type="dxa" w:w="903"/>
             <w:tcBorders>
               <w:top w:val="none" w:color="FFFFFF" w:sz="0"/>
               <w:left w:val="none" w:color="FFFFFF" w:sz="0"/>
@@ -658,7 +658,7 @@
         </w:tc>
         <w:tc>
           <w:tcPr>
-            <w:tcW w:type="dxa" w:w="1872"/>
+            <w:tcW w:type="dxa" w:w="1805"/>
             <w:tcBorders>
               <w:top w:val="none" w:color="FFFFFF" w:sz="0"/>
               <w:left w:val="none" w:color="FFFFFF" w:sz="0"/>
@@ -683,7 +683,7 @@
         </w:tc>
         <w:tc>
           <w:tcPr>
-            <w:tcW w:type="dxa" w:w="6552"/>
+            <w:tcW w:type="dxa" w:w="6318"/>
             <w:tcBorders>
               <w:top w:val="none" w:color="FFFFFF" w:sz="0"/>
               <w:left w:val="none" w:color="FFFFFF" w:sz="0"/>
@@ -713,7 +713,7 @@
         </w:trPr>
         <w:tc>
           <w:tcPr>
-            <w:tcW w:type="dxa" w:w="936"/>
+            <w:tcW w:type="dxa" w:w="903"/>
             <w:tcBorders>
               <w:top w:val="none" w:color="FFFFFF" w:sz="0"/>
               <w:left w:val="none" w:color="FFFFFF" w:sz="0"/>
@@ -739,7 +739,7 @@
         </w:tc>
         <w:tc>
           <w:tcPr>
-            <w:tcW w:type="dxa" w:w="1872"/>
+            <w:tcW w:type="dxa" w:w="1805"/>
             <w:tcBorders>
               <w:top w:val="none" w:color="FFFFFF" w:sz="0"/>
               <w:left w:val="none" w:color="FFFFFF" w:sz="0"/>
@@ -765,7 +765,7 @@
         </w:tc>
         <w:tc>
           <w:tcPr>
-            <w:tcW w:type="dxa" w:w="6552"/>
+            <w:tcW w:type="dxa" w:w="6318"/>
             <w:tcBorders>
               <w:top w:val="none" w:color="FFFFFF" w:sz="0"/>
               <w:left w:val="none" w:color="FFFFFF" w:sz="0"/>
@@ -796,7 +796,7 @@
         </w:trPr>
         <w:tc>
           <w:tcPr>
-            <w:tcW w:type="dxa" w:w="936"/>
+            <w:tcW w:type="dxa" w:w="903"/>
             <w:tcBorders>
               <w:top w:val="none" w:color="FFFFFF" w:sz="0"/>
               <w:left w:val="none" w:color="FFFFFF" w:sz="0"/>
@@ -821,7 +821,7 @@
         </w:tc>
         <w:tc>
           <w:tcPr>
-            <w:tcW w:type="dxa" w:w="1872"/>
+            <w:tcW w:type="dxa" w:w="1805"/>
             <w:tcBorders>
               <w:top w:val="none" w:color="FFFFFF" w:sz="0"/>
               <w:left w:val="none" w:color="FFFFFF" w:sz="0"/>
@@ -846,7 +846,7 @@
         </w:tc>
         <w:tc>
           <w:tcPr>
-            <w:tcW w:type="dxa" w:w="6552"/>
+            <w:tcW w:type="dxa" w:w="6318"/>
             <w:tcBorders>
               <w:top w:val="none" w:color="FFFFFF" w:sz="0"/>
               <w:left w:val="none" w:color="FFFFFF" w:sz="0"/>
@@ -876,7 +876,7 @@
         </w:trPr>
         <w:tc>
           <w:tcPr>
-            <w:tcW w:type="dxa" w:w="936"/>
+            <w:tcW w:type="dxa" w:w="903"/>
             <w:tcBorders>
               <w:top w:val="none" w:color="FFFFFF" w:sz="0"/>
               <w:left w:val="none" w:color="FFFFFF" w:sz="0"/>
@@ -902,7 +902,7 @@
         </w:tc>
         <w:tc>
           <w:tcPr>
-            <w:tcW w:type="dxa" w:w="1872"/>
+            <w:tcW w:type="dxa" w:w="1805"/>
             <w:tcBorders>
               <w:top w:val="none" w:color="FFFFFF" w:sz="0"/>
               <w:left w:val="none" w:color="FFFFFF" w:sz="0"/>
@@ -928,7 +928,7 @@
         </w:tc>
         <w:tc>
           <w:tcPr>
-            <w:tcW w:type="dxa" w:w="6552"/>
+            <w:tcW w:type="dxa" w:w="6318"/>
             <w:tcBorders>
               <w:top w:val="none" w:color="FFFFFF" w:sz="0"/>
               <w:left w:val="none" w:color="FFFFFF" w:sz="0"/>
@@ -959,7 +959,7 @@
         </w:trPr>
         <w:tc>
           <w:tcPr>
-            <w:tcW w:type="dxa" w:w="936"/>
+            <w:tcW w:type="dxa" w:w="903"/>
             <w:tcBorders>
               <w:top w:val="none" w:color="FFFFFF" w:sz="0"/>
               <w:left w:val="none" w:color="FFFFFF" w:sz="0"/>
@@ -984,7 +984,7 @@
         </w:tc>
         <w:tc>
           <w:tcPr>
-            <w:tcW w:type="dxa" w:w="1872"/>
+            <w:tcW w:type="dxa" w:w="1805"/>
             <w:tcBorders>
               <w:top w:val="none" w:color="FFFFFF" w:sz="0"/>
               <w:left w:val="none" w:color="FFFFFF" w:sz="0"/>
@@ -1009,7 +1009,7 @@
         </w:tc>
         <w:tc>
           <w:tcPr>
-            <w:tcW w:type="dxa" w:w="6552"/>
+            <w:tcW w:type="dxa" w:w="6318"/>
             <w:tcBorders>
               <w:top w:val="none" w:color="FFFFFF" w:sz="0"/>
               <w:left w:val="none" w:color="FFFFFF" w:sz="0"/>
@@ -1039,7 +1039,7 @@
         </w:trPr>
         <w:tc>
           <w:tcPr>
-            <w:tcW w:type="dxa" w:w="936"/>
+            <w:tcW w:type="dxa" w:w="903"/>
             <w:tcBorders>
               <w:top w:val="none" w:color="FFFFFF" w:sz="0"/>
               <w:left w:val="none" w:color="FFFFFF" w:sz="0"/>
@@ -1065,7 +1065,7 @@
         </w:tc>
         <w:tc>
           <w:tcPr>
-            <w:tcW w:type="dxa" w:w="1872"/>
+            <w:tcW w:type="dxa" w:w="1805"/>
             <w:tcBorders>
               <w:top w:val="none" w:color="FFFFFF" w:sz="0"/>
               <w:left w:val="none" w:color="FFFFFF" w:sz="0"/>
@@ -1091,7 +1091,7 @@
         </w:tc>
         <w:tc>
           <w:tcPr>
-            <w:tcW w:type="dxa" w:w="6552"/>
+            <w:tcW w:type="dxa" w:w="6318"/>
             <w:tcBorders>
               <w:top w:val="none" w:color="FFFFFF" w:sz="0"/>
               <w:left w:val="none" w:color="FFFFFF" w:sz="0"/>
@@ -1152,7 +1152,7 @@
     </w:p>
     <w:tbl>
       <w:tblPr>
-        <w:tblW w:type="dxa" w:w="9360"/>
+        <w:tblW w:type="dxa" w:w="9026"/>
         <w:tblBorders>
           <w:top w:val="single" w:color="auto" w:sz="4"/>
           <w:left w:val="single" w:color="auto" w:sz="4"/>
@@ -1164,7 +1164,7 @@
         <w:tblLayout w:type="fixed"/>
       </w:tblPr>
       <w:tblGrid>
-        <w:gridCol w:w="9360"/>
+        <w:gridCol w:w="9026"/>
       </w:tblGrid>
       <w:tr>
         <w:trPr>
@@ -1173,7 +1173,7 @@
         </w:trPr>
         <w:tc>
           <w:tcPr>
-            <w:tcW w:type="dxa" w:w="9360"/>
+            <w:tcW w:type="dxa" w:w="9026"/>
             <w:tcBorders>
               <w:top w:val="single" w:color="1F3864" w:sz="6"/>
               <w:left w:val="single" w:color="1F3864" w:sz="6"/>
@@ -1246,7 +1246,7 @@
       <w:tr>
         <w:tc>
           <w:tcPr>
-            <w:tcW w:type="dxa" w:w="9360"/>
+            <w:tcW w:type="dxa" w:w="9026"/>
             <w:tcBorders>
               <w:top w:val="none" w:color="FFFFFF" w:sz="0"/>
               <w:left w:val="single" w:color="1F3864" w:sz="6"/>
@@ -1335,7 +1335,7 @@
     </w:p>
     <w:tbl>
       <w:tblPr>
-        <w:tblW w:type="dxa" w:w="9360"/>
+        <w:tblW w:type="dxa" w:w="9026"/>
         <w:tblBorders>
           <w:top w:val="single" w:color="auto" w:sz="4"/>
           <w:left w:val="single" w:color="auto" w:sz="4"/>
@@ -1347,7 +1347,7 @@
         <w:tblLayout w:type="fixed"/>
       </w:tblPr>
       <w:tblGrid>
-        <w:gridCol w:w="9360"/>
+        <w:gridCol w:w="9026"/>
       </w:tblGrid>
       <w:tr>
         <w:trPr>
@@ -1356,7 +1356,7 @@
         </w:trPr>
         <w:tc>
           <w:tcPr>
-            <w:tcW w:type="dxa" w:w="9360"/>
+            <w:tcW w:type="dxa" w:w="9026"/>
             <w:tcBorders>
               <w:top w:val="single" w:color="0D5C63" w:sz="6"/>
               <w:left w:val="single" w:color="0D5C63" w:sz="6"/>
@@ -1429,7 +1429,7 @@
       <w:tr>
         <w:tc>
           <w:tcPr>
-            <w:tcW w:type="dxa" w:w="9360"/>
+            <w:tcW w:type="dxa" w:w="9026"/>
             <w:tcBorders>
               <w:top w:val="none" w:color="FFFFFF" w:sz="0"/>
               <w:left w:val="single" w:color="0D5C63" w:sz="6"/>
@@ -1553,7 +1553,7 @@
     </w:p>
     <w:tbl>
       <w:tblPr>
-        <w:tblW w:type="dxa" w:w="9360"/>
+        <w:tblW w:type="dxa" w:w="9026"/>
         <w:tblBorders>
           <w:top w:val="single" w:color="auto" w:sz="4"/>
           <w:left w:val="single" w:color="auto" w:sz="4"/>
@@ -1565,7 +1565,7 @@
         <w:tblLayout w:type="fixed"/>
       </w:tblPr>
       <w:tblGrid>
-        <w:gridCol w:w="9360"/>
+        <w:gridCol w:w="9026"/>
       </w:tblGrid>
       <w:tr>
         <w:trPr>
@@ -1574,7 +1574,7 @@
         </w:trPr>
         <w:tc>
           <w:tcPr>
-            <w:tcW w:type="dxa" w:w="9360"/>
+            <w:tcW w:type="dxa" w:w="9026"/>
             <w:tcBorders>
               <w:top w:val="single" w:color="8A4B00" w:sz="24"/>
               <w:left w:val="single" w:color="E8C58A" w:sz="6"/>
@@ -1647,7 +1647,7 @@
       <w:tr>
         <w:tc>
           <w:tcPr>
-            <w:tcW w:type="dxa" w:w="9360"/>
+            <w:tcW w:type="dxa" w:w="9026"/>
             <w:tcBorders>
               <w:top w:val="none" w:color="FFFFFF" w:sz="0"/>
               <w:left w:val="single" w:color="E8C58A" w:sz="6"/>
@@ -1696,7 +1696,7 @@
     </w:p>
     <w:tbl>
       <w:tblPr>
-        <w:tblW w:type="dxa" w:w="9360"/>
+        <w:tblW w:type="dxa" w:w="9026"/>
         <w:tblBorders>
           <w:top w:val="single" w:color="auto" w:sz="4"/>
           <w:left w:val="single" w:color="auto" w:sz="4"/>
@@ -1708,7 +1708,7 @@
         <w:tblLayout w:type="fixed"/>
       </w:tblPr>
       <w:tblGrid>
-        <w:gridCol w:w="9360"/>
+        <w:gridCol w:w="9026"/>
       </w:tblGrid>
       <w:tr>
         <w:trPr>
@@ -1717,7 +1717,7 @@
         </w:trPr>
         <w:tc>
           <w:tcPr>
-            <w:tcW w:type="dxa" w:w="9360"/>
+            <w:tcW w:type="dxa" w:w="9026"/>
             <w:tcBorders>
               <w:top w:val="single" w:color="A3271C" w:sz="24"/>
               <w:left w:val="single" w:color="E9B1A9" w:sz="6"/>
@@ -1790,7 +1790,7 @@
       <w:tr>
         <w:tc>
           <w:tcPr>
-            <w:tcW w:type="dxa" w:w="9360"/>
+            <w:tcW w:type="dxa" w:w="9026"/>
             <w:tcBorders>
               <w:top w:val="none" w:color="FFFFFF" w:sz="0"/>
               <w:left w:val="single" w:color="E9B1A9" w:sz="6"/>
@@ -1869,7 +1869,7 @@
     </w:p>
     <w:tbl>
       <w:tblPr>
-        <w:tblW w:type="dxa" w:w="9360"/>
+        <w:tblW w:type="dxa" w:w="9026"/>
         <w:tblBorders>
           <w:top w:val="single" w:color="auto" w:sz="4"/>
           <w:left w:val="single" w:color="auto" w:sz="4"/>
@@ -1881,7 +1881,7 @@
         <w:tblLayout w:type="fixed"/>
       </w:tblPr>
       <w:tblGrid>
-        <w:gridCol w:w="9360"/>
+        <w:gridCol w:w="9026"/>
       </w:tblGrid>
       <w:tr>
         <w:trPr>
@@ -1890,7 +1890,7 @@
         </w:trPr>
         <w:tc>
           <w:tcPr>
-            <w:tcW w:type="dxa" w:w="9360"/>
+            <w:tcW w:type="dxa" w:w="9026"/>
             <w:tcBorders>
               <w:top w:val="single" w:color="8B2F62" w:sz="24"/>
               <w:left w:val="single" w:color="E5B5CF" w:sz="6"/>
@@ -1969,7 +1969,7 @@
       <w:tr>
         <w:tc>
           <w:tcPr>
-            <w:tcW w:type="dxa" w:w="9360"/>
+            <w:tcW w:type="dxa" w:w="9026"/>
             <w:tcBorders>
               <w:top w:val="none" w:color="FFFFFF" w:sz="0"/>
               <w:left w:val="single" w:color="E5B5CF" w:sz="6"/>
@@ -2048,7 +2048,7 @@
     </w:p>
     <w:tbl>
       <w:tblPr>
-        <w:tblW w:type="dxa" w:w="9360"/>
+        <w:tblW w:type="dxa" w:w="9026"/>
         <w:tblBorders>
           <w:top w:val="single" w:color="auto" w:sz="4"/>
           <w:left w:val="single" w:color="auto" w:sz="4"/>
@@ -2060,7 +2060,7 @@
         <w:tblLayout w:type="fixed"/>
       </w:tblPr>
       <w:tblGrid>
-        <w:gridCol w:w="9360"/>
+        <w:gridCol w:w="9026"/>
       </w:tblGrid>
       <w:tr>
         <w:trPr>
@@ -2069,7 +2069,7 @@
         </w:trPr>
         <w:tc>
           <w:tcPr>
-            <w:tcW w:type="dxa" w:w="9360"/>
+            <w:tcW w:type="dxa" w:w="9026"/>
             <w:tcBorders>
               <w:top w:val="single" w:color="CDB8E4" w:sz="6"/>
               <w:left w:val="single" w:color="CDB8E4" w:sz="6"/>
@@ -2141,7 +2141,7 @@
       <w:tr>
         <w:tc>
           <w:tcPr>
-            <w:tcW w:type="dxa" w:w="9360"/>
+            <w:tcW w:type="dxa" w:w="9026"/>
             <w:tcBorders>
               <w:top w:val="none" w:color="FFFFFF" w:sz="0"/>
               <w:left w:val="single" w:color="CDB8E4" w:sz="6"/>
@@ -2229,7 +2229,7 @@
     </w:p>
     <w:tbl>
       <w:tblPr>
-        <w:tblW w:type="dxa" w:w="9360"/>
+        <w:tblW w:type="dxa" w:w="9026"/>
         <w:tblBorders>
           <w:top w:val="single" w:color="auto" w:sz="4"/>
           <w:left w:val="single" w:color="auto" w:sz="4"/>
@@ -2241,7 +2241,7 @@
         <w:tblLayout w:type="fixed"/>
       </w:tblPr>
       <w:tblGrid>
-        <w:gridCol w:w="9360"/>
+        <w:gridCol w:w="9026"/>
       </w:tblGrid>
       <w:tr>
         <w:trPr>
@@ -2250,7 +2250,7 @@
         </w:trPr>
         <w:tc>
           <w:tcPr>
-            <w:tcW w:type="dxa" w:w="9360"/>
+            <w:tcW w:type="dxa" w:w="9026"/>
             <w:tcBorders>
               <w:top w:val="single" w:color="A9C8DC" w:sz="6"/>
               <w:left w:val="single" w:color="A9C8DC" w:sz="6"/>
@@ -2322,7 +2322,7 @@
       <w:tr>
         <w:tc>
           <w:tcPr>
-            <w:tcW w:type="dxa" w:w="9360"/>
+            <w:tcW w:type="dxa" w:w="9026"/>
             <w:tcBorders>
               <w:top w:val="none" w:color="FFFFFF" w:sz="0"/>
               <w:left w:val="single" w:color="A9C8DC" w:sz="6"/>
@@ -2410,7 +2410,7 @@
     </w:p>
     <w:tbl>
       <w:tblPr>
-        <w:tblW w:type="dxa" w:w="9360"/>
+        <w:tblW w:type="dxa" w:w="9026"/>
         <w:tblBorders>
           <w:top w:val="single" w:color="auto" w:sz="4"/>
           <w:left w:val="single" w:color="auto" w:sz="4"/>
@@ -2422,7 +2422,7 @@
         <w:tblLayout w:type="fixed"/>
       </w:tblPr>
       <w:tblGrid>
-        <w:gridCol w:w="9360"/>
+        <w:gridCol w:w="9026"/>
       </w:tblGrid>
       <w:tr>
         <w:trPr>
@@ -2431,7 +2431,7 @@
         </w:trPr>
         <w:tc>
           <w:tcPr>
-            <w:tcW w:type="dxa" w:w="9360"/>
+            <w:tcW w:type="dxa" w:w="9026"/>
             <w:tcBorders>
               <w:top w:val="single" w:color="B3D3A8" w:sz="6"/>
               <w:left w:val="single" w:color="B3D3A8" w:sz="6"/>
@@ -2503,7 +2503,7 @@
       <w:tr>
         <w:tc>
           <w:tcPr>
-            <w:tcW w:type="dxa" w:w="9360"/>
+            <w:tcW w:type="dxa" w:w="9026"/>
             <w:tcBorders>
               <w:top w:val="none" w:color="FFFFFF" w:sz="0"/>
               <w:left w:val="single" w:color="B3D3A8" w:sz="6"/>
@@ -2571,7 +2571,7 @@
     </w:p>
     <w:tbl>
       <w:tblPr>
-        <w:tblW w:type="dxa" w:w="9360"/>
+        <w:tblW w:type="dxa" w:w="9026"/>
         <w:tblBorders>
           <w:top w:val="single" w:color="auto" w:sz="4"/>
           <w:left w:val="single" w:color="auto" w:sz="4"/>
@@ -2583,7 +2583,7 @@
         <w:tblLayout w:type="fixed"/>
       </w:tblPr>
       <w:tblGrid>
-        <w:gridCol w:w="9360"/>
+        <w:gridCol w:w="9026"/>
       </w:tblGrid>
       <w:tr>
         <w:trPr>
@@ -2592,7 +2592,7 @@
         </w:trPr>
         <w:tc>
           <w:tcPr>
-            <w:tcW w:type="dxa" w:w="9360"/>
+            <w:tcW w:type="dxa" w:w="9026"/>
             <w:tcBorders>
               <w:top w:val="single" w:color="C7CCD5" w:sz="6"/>
               <w:left w:val="single" w:color="C7CCD5" w:sz="6"/>
@@ -2664,7 +2664,7 @@
       <w:tr>
         <w:tc>
           <w:tcPr>
-            <w:tcW w:type="dxa" w:w="9360"/>
+            <w:tcW w:type="dxa" w:w="9026"/>
             <w:tcBorders>
               <w:top w:val="none" w:color="FFFFFF" w:sz="0"/>
               <w:left w:val="single" w:color="C7CCD5" w:sz="6"/>
@@ -2755,7 +2755,7 @@
     </w:p>
     <w:tbl>
       <w:tblPr>
-        <w:tblW w:type="dxa" w:w="9360"/>
+        <w:tblW w:type="dxa" w:w="9026"/>
         <w:tblBorders>
           <w:top w:val="single" w:color="auto" w:sz="4"/>
           <w:left w:val="single" w:color="auto" w:sz="4"/>
@@ -2767,7 +2767,7 @@
         <w:tblLayout w:type="fixed"/>
       </w:tblPr>
       <w:tblGrid>
-        <w:gridCol w:w="9360"/>
+        <w:gridCol w:w="9026"/>
       </w:tblGrid>
       <w:tr>
         <w:trPr>
@@ -2776,7 +2776,7 @@
         </w:trPr>
         <w:tc>
           <w:tcPr>
-            <w:tcW w:type="dxa" w:w="9360"/>
+            <w:tcW w:type="dxa" w:w="9026"/>
             <w:tcBorders>
               <w:top w:val="single" w:color="1F3864" w:sz="6"/>
               <w:left w:val="single" w:color="1F3864" w:sz="6"/>
@@ -2849,7 +2849,7 @@
       <w:tr>
         <w:tc>
           <w:tcPr>
-            <w:tcW w:type="dxa" w:w="9360"/>
+            <w:tcW w:type="dxa" w:w="9026"/>
             <w:tcBorders>
               <w:top w:val="none" w:color="FFFFFF" w:sz="0"/>
               <w:left w:val="single" w:color="1F3864" w:sz="6"/>
@@ -2938,7 +2938,7 @@
     </w:p>
     <w:tbl>
       <w:tblPr>
-        <w:tblW w:type="dxa" w:w="9360"/>
+        <w:tblW w:type="dxa" w:w="9026"/>
         <w:tblBorders>
           <w:top w:val="single" w:color="auto" w:sz="4"/>
           <w:left w:val="single" w:color="auto" w:sz="4"/>
@@ -2950,7 +2950,7 @@
         <w:tblLayout w:type="fixed"/>
       </w:tblPr>
       <w:tblGrid>
-        <w:gridCol w:w="9360"/>
+        <w:gridCol w:w="9026"/>
       </w:tblGrid>
       <w:tr>
         <w:trPr>
@@ -2959,7 +2959,7 @@
         </w:trPr>
         <w:tc>
           <w:tcPr>
-            <w:tcW w:type="dxa" w:w="9360"/>
+            <w:tcW w:type="dxa" w:w="9026"/>
             <w:tcBorders>
               <w:top w:val="single" w:color="0D5C63" w:sz="6"/>
               <w:left w:val="single" w:color="0D5C63" w:sz="6"/>
@@ -3032,7 +3032,7 @@
       <w:tr>
         <w:tc>
           <w:tcPr>
-            <w:tcW w:type="dxa" w:w="9360"/>
+            <w:tcW w:type="dxa" w:w="9026"/>
             <w:tcBorders>
               <w:top w:val="none" w:color="FFFFFF" w:sz="0"/>
               <w:left w:val="single" w:color="0D5C63" w:sz="6"/>
@@ -3207,7 +3207,7 @@
     </w:p>
     <w:tbl>
       <w:tblPr>
-        <w:tblW w:type="dxa" w:w="9360"/>
+        <w:tblW w:type="dxa" w:w="9026"/>
         <w:tblBorders>
           <w:top w:val="single" w:color="auto" w:sz="4"/>
           <w:left w:val="single" w:color="auto" w:sz="4"/>
@@ -3219,9 +3219,9 @@
         <w:tblLayout w:type="fixed"/>
       </w:tblPr>
       <w:tblGrid>
-        <w:gridCol w:w="2059"/>
-        <w:gridCol w:w="3650"/>
-        <w:gridCol w:w="3651"/>
+        <w:gridCol w:w="1986"/>
+        <w:gridCol w:w="3520"/>
+        <w:gridCol w:w="3520"/>
       </w:tblGrid>
       <w:tr>
         <w:trPr>
@@ -3229,7 +3229,7 @@
         </w:trPr>
         <w:tc>
           <w:tcPr>
-            <w:tcW w:type="dxa" w:w="2059"/>
+            <w:tcW w:type="dxa" w:w="1986"/>
             <w:tcBorders>
               <w:top w:val="single" w:color="6F7F99" w:sz="12"/>
               <w:left w:val="none" w:color="FFFFFF" w:sz="0"/>
@@ -3255,7 +3255,7 @@
         </w:tc>
         <w:tc>
           <w:tcPr>
-            <w:tcW w:type="dxa" w:w="3650"/>
+            <w:tcW w:type="dxa" w:w="3520"/>
             <w:tcBorders>
               <w:top w:val="single" w:color="6F7F99" w:sz="12"/>
               <w:left w:val="none" w:color="FFFFFF" w:sz="0"/>
@@ -3281,7 +3281,7 @@
         </w:tc>
         <w:tc>
           <w:tcPr>
-            <w:tcW w:type="dxa" w:w="3651"/>
+            <w:tcW w:type="dxa" w:w="3520"/>
             <w:tcBorders>
               <w:top w:val="single" w:color="6F7F99" w:sz="12"/>
               <w:left w:val="none" w:color="FFFFFF" w:sz="0"/>
@@ -3312,7 +3312,7 @@
         </w:trPr>
         <w:tc>
           <w:tcPr>
-            <w:tcW w:type="dxa" w:w="2059"/>
+            <w:tcW w:type="dxa" w:w="1986"/>
             <w:tcBorders>
               <w:top w:val="none" w:color="FFFFFF" w:sz="0"/>
               <w:left w:val="none" w:color="FFFFFF" w:sz="0"/>
@@ -3337,7 +3337,7 @@
         </w:tc>
         <w:tc>
           <w:tcPr>
-            <w:tcW w:type="dxa" w:w="3650"/>
+            <w:tcW w:type="dxa" w:w="3520"/>
             <w:tcBorders>
               <w:top w:val="none" w:color="FFFFFF" w:sz="0"/>
               <w:left w:val="none" w:color="FFFFFF" w:sz="0"/>
@@ -3362,7 +3362,7 @@
         </w:tc>
         <w:tc>
           <w:tcPr>
-            <w:tcW w:type="dxa" w:w="3651"/>
+            <w:tcW w:type="dxa" w:w="3520"/>
             <w:tcBorders>
               <w:top w:val="none" w:color="FFFFFF" w:sz="0"/>
               <w:left w:val="none" w:color="FFFFFF" w:sz="0"/>
@@ -3392,7 +3392,7 @@
         </w:trPr>
         <w:tc>
           <w:tcPr>
-            <w:tcW w:type="dxa" w:w="2059"/>
+            <w:tcW w:type="dxa" w:w="1986"/>
             <w:tcBorders>
               <w:top w:val="none" w:color="FFFFFF" w:sz="0"/>
               <w:left w:val="none" w:color="FFFFFF" w:sz="0"/>
@@ -3418,7 +3418,7 @@
         </w:tc>
         <w:tc>
           <w:tcPr>
-            <w:tcW w:type="dxa" w:w="3650"/>
+            <w:tcW w:type="dxa" w:w="3520"/>
             <w:tcBorders>
               <w:top w:val="none" w:color="FFFFFF" w:sz="0"/>
               <w:left w:val="none" w:color="FFFFFF" w:sz="0"/>
@@ -3444,7 +3444,7 @@
         </w:tc>
         <w:tc>
           <w:tcPr>
-            <w:tcW w:type="dxa" w:w="3651"/>
+            <w:tcW w:type="dxa" w:w="3520"/>
             <w:tcBorders>
               <w:top w:val="none" w:color="FFFFFF" w:sz="0"/>
               <w:left w:val="none" w:color="FFFFFF" w:sz="0"/>
@@ -3475,7 +3475,7 @@
         </w:trPr>
         <w:tc>
           <w:tcPr>
-            <w:tcW w:type="dxa" w:w="2059"/>
+            <w:tcW w:type="dxa" w:w="1986"/>
             <w:tcBorders>
               <w:top w:val="none" w:color="FFFFFF" w:sz="0"/>
               <w:left w:val="none" w:color="FFFFFF" w:sz="0"/>
@@ -3500,7 +3500,7 @@
         </w:tc>
         <w:tc>
           <w:tcPr>
-            <w:tcW w:type="dxa" w:w="3650"/>
+            <w:tcW w:type="dxa" w:w="3520"/>
             <w:tcBorders>
               <w:top w:val="none" w:color="FFFFFF" w:sz="0"/>
               <w:left w:val="none" w:color="FFFFFF" w:sz="0"/>
@@ -3525,7 +3525,7 @@
         </w:tc>
         <w:tc>
           <w:tcPr>
-            <w:tcW w:type="dxa" w:w="3651"/>
+            <w:tcW w:type="dxa" w:w="3520"/>
             <w:tcBorders>
               <w:top w:val="none" w:color="FFFFFF" w:sz="0"/>
               <w:left w:val="none" w:color="FFFFFF" w:sz="0"/>
@@ -3580,7 +3580,7 @@
     </w:p>
     <w:tbl>
       <w:tblPr>
-        <w:tblW w:type="dxa" w:w="9360"/>
+        <w:tblW w:type="dxa" w:w="9026"/>
         <w:tblBorders>
           <w:top w:val="single" w:color="auto" w:sz="4"/>
           <w:left w:val="single" w:color="auto" w:sz="4"/>
@@ -3592,7 +3592,7 @@
         <w:tblLayout w:type="fixed"/>
       </w:tblPr>
       <w:tblGrid>
-        <w:gridCol w:w="9360"/>
+        <w:gridCol w:w="9026"/>
       </w:tblGrid>
       <w:tr>
         <w:trPr>
@@ -3601,7 +3601,7 @@
         </w:trPr>
         <w:tc>
           <w:tcPr>
-            <w:tcW w:type="dxa" w:w="9360"/>
+            <w:tcW w:type="dxa" w:w="9026"/>
             <w:tcBorders>
               <w:top w:val="single" w:color="CDB8E4" w:sz="6"/>
               <w:left w:val="single" w:color="CDB8E4" w:sz="6"/>
@@ -3673,7 +3673,7 @@
       <w:tr>
         <w:tc>
           <w:tcPr>
-            <w:tcW w:type="dxa" w:w="9360"/>
+            <w:tcW w:type="dxa" w:w="9026"/>
             <w:tcBorders>
               <w:top w:val="none" w:color="FFFFFF" w:sz="0"/>
               <w:left w:val="single" w:color="CDB8E4" w:sz="6"/>
@@ -3735,7 +3735,7 @@
     </w:p>
     <w:tbl>
       <w:tblPr>
-        <w:tblW w:type="dxa" w:w="9360"/>
+        <w:tblW w:type="dxa" w:w="9026"/>
         <w:tblBorders>
           <w:top w:val="single" w:color="auto" w:sz="4"/>
           <w:left w:val="single" w:color="auto" w:sz="4"/>
@@ -3747,7 +3747,7 @@
         <w:tblLayout w:type="fixed"/>
       </w:tblPr>
       <w:tblGrid>
-        <w:gridCol w:w="9360"/>
+        <w:gridCol w:w="9026"/>
       </w:tblGrid>
       <w:tr>
         <w:trPr>
@@ -3756,7 +3756,7 @@
         </w:trPr>
         <w:tc>
           <w:tcPr>
-            <w:tcW w:type="dxa" w:w="9360"/>
+            <w:tcW w:type="dxa" w:w="9026"/>
             <w:tcBorders>
               <w:top w:val="single" w:color="A9C8DC" w:sz="6"/>
               <w:left w:val="single" w:color="A9C8DC" w:sz="6"/>
@@ -3828,7 +3828,7 @@
       <w:tr>
         <w:tc>
           <w:tcPr>
-            <w:tcW w:type="dxa" w:w="9360"/>
+            <w:tcW w:type="dxa" w:w="9026"/>
             <w:tcBorders>
               <w:top w:val="none" w:color="FFFFFF" w:sz="0"/>
               <w:left w:val="single" w:color="A9C8DC" w:sz="6"/>
@@ -3890,7 +3890,7 @@
     </w:p>
     <w:tbl>
       <w:tblPr>
-        <w:tblW w:type="dxa" w:w="9360"/>
+        <w:tblW w:type="dxa" w:w="9026"/>
         <w:tblBorders>
           <w:top w:val="single" w:color="auto" w:sz="4"/>
           <w:left w:val="single" w:color="auto" w:sz="4"/>
@@ -3902,7 +3902,7 @@
         <w:tblLayout w:type="fixed"/>
       </w:tblPr>
       <w:tblGrid>
-        <w:gridCol w:w="9360"/>
+        <w:gridCol w:w="9026"/>
       </w:tblGrid>
       <w:tr>
         <w:trPr>
@@ -3911,7 +3911,7 @@
         </w:trPr>
         <w:tc>
           <w:tcPr>
-            <w:tcW w:type="dxa" w:w="9360"/>
+            <w:tcW w:type="dxa" w:w="9026"/>
             <w:tcBorders>
               <w:top w:val="single" w:color="B3D3A8" w:sz="6"/>
               <w:left w:val="single" w:color="B3D3A8" w:sz="6"/>
@@ -3983,7 +3983,7 @@
       <w:tr>
         <w:tc>
           <w:tcPr>
-            <w:tcW w:type="dxa" w:w="9360"/>
+            <w:tcW w:type="dxa" w:w="9026"/>
             <w:tcBorders>
               <w:top w:val="none" w:color="FFFFFF" w:sz="0"/>
               <w:left w:val="single" w:color="B3D3A8" w:sz="6"/>
@@ -4050,7 +4050,7 @@
     </w:p>
     <w:tbl>
       <w:tblPr>
-        <w:tblW w:type="dxa" w:w="9360"/>
+        <w:tblW w:type="dxa" w:w="9026"/>
         <w:tblBorders>
           <w:top w:val="single" w:color="auto" w:sz="4"/>
           <w:left w:val="single" w:color="auto" w:sz="4"/>
@@ -4062,10 +4062,10 @@
         <w:tblLayout w:type="fixed"/>
       </w:tblPr>
       <w:tblGrid>
-        <w:gridCol w:w="1310"/>
-        <w:gridCol w:w="2059"/>
-        <w:gridCol w:w="2246"/>
-        <w:gridCol w:w="3745"/>
+        <w:gridCol w:w="1264"/>
+        <w:gridCol w:w="1986"/>
+        <w:gridCol w:w="2166"/>
+        <w:gridCol w:w="3610"/>
       </w:tblGrid>
       <w:tr>
         <w:trPr>
@@ -4073,7 +4073,7 @@
         </w:trPr>
         <w:tc>
           <w:tcPr>
-            <w:tcW w:type="dxa" w:w="1310"/>
+            <w:tcW w:type="dxa" w:w="1264"/>
             <w:tcBorders>
               <w:top w:val="single" w:color="6F7F99" w:sz="12"/>
               <w:left w:val="none" w:color="FFFFFF" w:sz="0"/>
@@ -4099,7 +4099,7 @@
         </w:tc>
         <w:tc>
           <w:tcPr>
-            <w:tcW w:type="dxa" w:w="2059"/>
+            <w:tcW w:type="dxa" w:w="1986"/>
             <w:tcBorders>
               <w:top w:val="single" w:color="6F7F99" w:sz="12"/>
               <w:left w:val="none" w:color="FFFFFF" w:sz="0"/>
@@ -4125,7 +4125,7 @@
         </w:tc>
         <w:tc>
           <w:tcPr>
-            <w:tcW w:type="dxa" w:w="2246"/>
+            <w:tcW w:type="dxa" w:w="2166"/>
             <w:tcBorders>
               <w:top w:val="single" w:color="6F7F99" w:sz="12"/>
               <w:left w:val="none" w:color="FFFFFF" w:sz="0"/>
@@ -4151,7 +4151,7 @@
         </w:tc>
         <w:tc>
           <w:tcPr>
-            <w:tcW w:type="dxa" w:w="3745"/>
+            <w:tcW w:type="dxa" w:w="3610"/>
             <w:tcBorders>
               <w:top w:val="single" w:color="6F7F99" w:sz="12"/>
               <w:left w:val="none" w:color="FFFFFF" w:sz="0"/>
@@ -4182,7 +4182,7 @@
         </w:trPr>
         <w:tc>
           <w:tcPr>
-            <w:tcW w:type="dxa" w:w="1310"/>
+            <w:tcW w:type="dxa" w:w="1264"/>
             <w:tcBorders>
               <w:top w:val="none" w:color="FFFFFF" w:sz="0"/>
               <w:left w:val="none" w:color="FFFFFF" w:sz="0"/>
@@ -4207,7 +4207,7 @@
         </w:tc>
         <w:tc>
           <w:tcPr>
-            <w:tcW w:type="dxa" w:w="2059"/>
+            <w:tcW w:type="dxa" w:w="1986"/>
             <w:tcBorders>
               <w:top w:val="none" w:color="FFFFFF" w:sz="0"/>
               <w:left w:val="none" w:color="FFFFFF" w:sz="0"/>
@@ -4232,7 +4232,7 @@
         </w:tc>
         <w:tc>
           <w:tcPr>
-            <w:tcW w:type="dxa" w:w="2246"/>
+            <w:tcW w:type="dxa" w:w="2166"/>
             <w:tcBorders>
               <w:top w:val="none" w:color="FFFFFF" w:sz="0"/>
               <w:left w:val="none" w:color="FFFFFF" w:sz="0"/>
@@ -4257,7 +4257,7 @@
         </w:tc>
         <w:tc>
           <w:tcPr>
-            <w:tcW w:type="dxa" w:w="3745"/>
+            <w:tcW w:type="dxa" w:w="3610"/>
             <w:tcBorders>
               <w:top w:val="none" w:color="FFFFFF" w:sz="0"/>
               <w:left w:val="none" w:color="FFFFFF" w:sz="0"/>
@@ -4287,7 +4287,7 @@
         </w:trPr>
         <w:tc>
           <w:tcPr>
-            <w:tcW w:type="dxa" w:w="1310"/>
+            <w:tcW w:type="dxa" w:w="1264"/>
             <w:tcBorders>
               <w:top w:val="none" w:color="FFFFFF" w:sz="0"/>
               <w:left w:val="none" w:color="FFFFFF" w:sz="0"/>
@@ -4313,7 +4313,7 @@
         </w:tc>
         <w:tc>
           <w:tcPr>
-            <w:tcW w:type="dxa" w:w="2059"/>
+            <w:tcW w:type="dxa" w:w="1986"/>
             <w:tcBorders>
               <w:top w:val="none" w:color="FFFFFF" w:sz="0"/>
               <w:left w:val="none" w:color="FFFFFF" w:sz="0"/>
@@ -4339,7 +4339,7 @@
         </w:tc>
         <w:tc>
           <w:tcPr>
-            <w:tcW w:type="dxa" w:w="2246"/>
+            <w:tcW w:type="dxa" w:w="2166"/>
             <w:tcBorders>
               <w:top w:val="none" w:color="FFFFFF" w:sz="0"/>
               <w:left w:val="none" w:color="FFFFFF" w:sz="0"/>
@@ -4365,7 +4365,7 @@
         </w:tc>
         <w:tc>
           <w:tcPr>
-            <w:tcW w:type="dxa" w:w="3745"/>
+            <w:tcW w:type="dxa" w:w="3610"/>
             <w:tcBorders>
               <w:top w:val="none" w:color="FFFFFF" w:sz="0"/>
               <w:left w:val="none" w:color="FFFFFF" w:sz="0"/>
@@ -4408,7 +4408,7 @@
     </w:p>
     <w:tbl>
       <w:tblPr>
-        <w:tblW w:type="dxa" w:w="9360"/>
+        <w:tblW w:type="dxa" w:w="9026"/>
         <w:tblBorders>
           <w:top w:val="single" w:color="auto" w:sz="4"/>
           <w:left w:val="single" w:color="auto" w:sz="4"/>
@@ -4420,7 +4420,7 @@
         <w:tblLayout w:type="fixed"/>
       </w:tblPr>
       <w:tblGrid>
-        <w:gridCol w:w="9360"/>
+        <w:gridCol w:w="9026"/>
       </w:tblGrid>
       <w:tr>
         <w:trPr>
@@ -4429,7 +4429,7 @@
         </w:trPr>
         <w:tc>
           <w:tcPr>
-            <w:tcW w:type="dxa" w:w="9360"/>
+            <w:tcW w:type="dxa" w:w="9026"/>
             <w:tcBorders>
               <w:top w:val="single" w:color="C7CCD5" w:sz="6"/>
               <w:left w:val="single" w:color="C7CCD5" w:sz="6"/>
@@ -4501,7 +4501,7 @@
       <w:tr>
         <w:tc>
           <w:tcPr>
-            <w:tcW w:type="dxa" w:w="9360"/>
+            <w:tcW w:type="dxa" w:w="9026"/>
             <w:tcBorders>
               <w:top w:val="none" w:color="FFFFFF" w:sz="0"/>
               <w:left w:val="single" w:color="C7CCD5" w:sz="6"/>

</xml_diff>

<commit_message>
New cover: one A4 page, mosaic variant by default, matching Word cover
TitlePage now fills one A4 page: title block at the top; ribbon, credits
and details at the foot. The default "mosaic" variant opens with the nine
box colours and icons in their order in a unit. `variant` also offers
"band", "motif" and "editorial" (with a large `volume` number). On screen
the cover keeps the A4 proportion; in print it fills the page and ends
it, and `bleed` runs the colour to the paper edge. A new `credits` prop
holds authors and institution, and any "[…]" line shows in a dashed frame
as a placeholder.

The Word template's first page is the mosaic cover, with white icons for
all nine boxes and dashed placeholders for authors and institution.

Co-Authored-By: Claude Opus 5.5 <noreply@anthropic.com>
</commit_message>
<xml_diff>
--- a/didactica-design-system/templates/Didactica-Universitaria-muestra.docx
+++ b/didactica-design-system/templates/Didactica-Universitaria-muestra.docx
@@ -2,6 +2,622 @@
 <file path=word/document.xml><?xml version="1.0" encoding="utf-8"?>
 <w:document xmlns:wpc="http://schemas.microsoft.com/office/word/2010/wordprocessingCanvas" xmlns:mc="http://schemas.openxmlformats.org/markup-compatibility/2006" xmlns:o="urn:schemas-microsoft-com:office:office" xmlns:r="http://schemas.openxmlformats.org/officeDocument/2006/relationships" xmlns:m="http://schemas.openxmlformats.org/officeDocument/2006/math" xmlns:v="urn:schemas-microsoft-com:vml" xmlns:wp14="http://schemas.microsoft.com/office/word/2010/wordprocessingDrawing" xmlns:wp="http://schemas.openxmlformats.org/drawingml/2006/wordprocessingDrawing" xmlns:w10="urn:schemas-microsoft-com:office:word" xmlns:w="http://schemas.openxmlformats.org/wordprocessingml/2006/main" xmlns:w14="http://schemas.microsoft.com/office/word/2010/wordml" xmlns:w15="http://schemas.microsoft.com/office/word/2012/wordml" xmlns:wpg="http://schemas.microsoft.com/office/word/2010/wordprocessingGroup" xmlns:wpi="http://schemas.microsoft.com/office/word/2010/wordprocessingInk" xmlns:wne="http://schemas.microsoft.com/office/word/2006/wordml" xmlns:wps="http://schemas.microsoft.com/office/word/2010/wordprocessingShape" xmlns:cx="http://schemas.microsoft.com/office/drawing/2014/chartex" xmlns:cx1="http://schemas.microsoft.com/office/drawing/2015/9/8/chartex" xmlns:cx2="http://schemas.microsoft.com/office/drawing/2015/10/21/chartex" xmlns:cx3="http://schemas.microsoft.com/office/drawing/2016/5/9/chartex" xmlns:cx4="http://schemas.microsoft.com/office/drawing/2016/5/10/chartex" xmlns:cx5="http://schemas.microsoft.com/office/drawing/2016/5/11/chartex" xmlns:cx6="http://schemas.microsoft.com/office/drawing/2016/5/12/chartex" xmlns:cx7="http://schemas.microsoft.com/office/drawing/2016/5/13/chartex" xmlns:cx8="http://schemas.microsoft.com/office/drawing/2016/5/14/chartex" xmlns:aink="http://schemas.microsoft.com/office/drawing/2016/ink" xmlns:am3d="http://schemas.microsoft.com/office/drawing/2017/model3d" xmlns:w16cex="http://schemas.microsoft.com/office/word/2018/wordml/cex" xmlns:w16cid="http://schemas.microsoft.com/office/word/2016/wordml/cid" xmlns:w16="http://schemas.microsoft.com/office/word/2018/wordml" xmlns:w16sdtdh="http://schemas.microsoft.com/office/word/2020/wordml/sdtdatahash" xmlns:w16se="http://schemas.microsoft.com/office/word/2015/wordml/symex" mc:Ignorable="w14 w15 wp14">
   <w:body>
+    <w:tbl>
+      <w:tblPr>
+        <w:tblW w:type="dxa" w:w="9018"/>
+        <w:tblBorders>
+          <w:top w:val="none" w:color="FFFFFF" w:sz="0"/>
+          <w:left w:val="none" w:color="FFFFFF" w:sz="0"/>
+          <w:bottom w:val="none" w:color="FFFFFF" w:sz="0"/>
+          <w:right w:val="none" w:color="FFFFFF" w:sz="0"/>
+          <w:insideH w:val="none" w:color="FFFFFF" w:sz="0"/>
+          <w:insideV w:val="none" w:color="FFFFFF" w:sz="0"/>
+        </w:tblBorders>
+        <w:tblLayout w:type="fixed"/>
+      </w:tblPr>
+      <w:tblGrid>
+        <w:gridCol w:w="1002"/>
+        <w:gridCol w:w="1002"/>
+        <w:gridCol w:w="1002"/>
+        <w:gridCol w:w="1002"/>
+        <w:gridCol w:w="1002"/>
+        <w:gridCol w:w="1002"/>
+        <w:gridCol w:w="1002"/>
+        <w:gridCol w:w="1002"/>
+        <w:gridCol w:w="1002"/>
+      </w:tblGrid>
+      <w:tr>
+        <w:trPr>
+          <w:cantSplit/>
+          <w:trHeight w:val="1002" w:hRule="exact"/>
+        </w:trPr>
+        <w:tc>
+          <w:tcPr>
+            <w:tcW w:type="dxa" w:w="1002"/>
+            <w:tcBorders>
+              <w:top w:val="none" w:color="FFFFFF" w:sz="0"/>
+              <w:left w:val="none" w:color="FFFFFF" w:sz="0"/>
+              <w:bottom w:val="none" w:color="FFFFFF" w:sz="0"/>
+              <w:right w:val="single" w:color="FFFFFF" w:sz="24"/>
+            </w:tcBorders>
+            <w:shd w:fill="1F3864" w:color="auto" w:val="clear"/>
+            <w:tcMar>
+              <w:top w:type="dxa" w:w="0"/>
+              <w:left w:type="dxa" w:w="0"/>
+              <w:bottom w:type="dxa" w:w="0"/>
+              <w:right w:type="dxa" w:w="0"/>
+            </w:tcMar>
+            <w:vAlign w:val="center"/>
+          </w:tcPr>
+          <w:p>
+            <w:pPr>
+              <w:spacing w:after="0" w:before="0"/>
+              <w:jc w:val="center"/>
+            </w:pPr>
+            <w:r>
+              <w:drawing>
+                <wp:inline distT="0" distB="0" distL="0" distR="0">
+                  <wp:extent cx="247650" cy="247650"/>
+                  <wp:effectExtent t="0" r="0" b="0" l="0"/>
+                  <wp:docPr id="1" name="" descr="" title=""/>
+                  <wp:cNvGraphicFramePr>
+                    <a:graphicFrameLocks xmlns:a="http://schemas.openxmlformats.org/drawingml/2006/main" noChangeAspect="1"/>
+                  </wp:cNvGraphicFramePr>
+                  <a:graphic xmlns:a="http://schemas.openxmlformats.org/drawingml/2006/main">
+                    <a:graphicData uri="http://schemas.openxmlformats.org/drawingml/2006/picture">
+                      <pic:pic xmlns:pic="http://schemas.openxmlformats.org/drawingml/2006/picture">
+                        <pic:nvPicPr>
+                          <pic:cNvPr id="0" name="" descr=""/>
+                          <pic:cNvPicPr>
+                            <a:picLocks noChangeAspect="1" noChangeArrowheads="1"/>
+                          </pic:cNvPicPr>
+                        </pic:nvPicPr>
+                        <pic:blipFill>
+                          <a:blip r:embed="rId11" cstate="none"/>
+                          <a:srcRect/>
+                          <a:stretch>
+                            <a:fillRect/>
+                          </a:stretch>
+                        </pic:blipFill>
+                        <pic:spPr bwMode="auto">
+                          <a:xfrm>
+                            <a:off x="0" y="0"/>
+                            <a:ext cx="247650" cy="247650"/>
+                          </a:xfrm>
+                          <a:prstGeom prst="rect">
+                            <a:avLst/>
+                          </a:prstGeom>
+                        </pic:spPr>
+                      </pic:pic>
+                    </a:graphicData>
+                  </a:graphic>
+                </wp:inline>
+              </w:drawing>
+            </w:r>
+          </w:p>
+        </w:tc>
+        <w:tc>
+          <w:tcPr>
+            <w:tcW w:type="dxa" w:w="1002"/>
+            <w:tcBorders>
+              <w:top w:val="none" w:color="FFFFFF" w:sz="0"/>
+              <w:left w:val="single" w:color="FFFFFF" w:sz="24"/>
+              <w:bottom w:val="none" w:color="FFFFFF" w:sz="0"/>
+              <w:right w:val="single" w:color="FFFFFF" w:sz="24"/>
+            </w:tcBorders>
+            <w:shd w:fill="0D5C63" w:color="auto" w:val="clear"/>
+            <w:tcMar>
+              <w:top w:type="dxa" w:w="0"/>
+              <w:left w:type="dxa" w:w="0"/>
+              <w:bottom w:type="dxa" w:w="0"/>
+              <w:right w:type="dxa" w:w="0"/>
+            </w:tcMar>
+            <w:vAlign w:val="center"/>
+          </w:tcPr>
+          <w:p>
+            <w:pPr>
+              <w:spacing w:after="0" w:before="0"/>
+              <w:jc w:val="center"/>
+            </w:pPr>
+            <w:r>
+              <w:drawing>
+                <wp:inline distT="0" distB="0" distL="0" distR="0">
+                  <wp:extent cx="247650" cy="247650"/>
+                  <wp:effectExtent t="0" r="0" b="0" l="0"/>
+                  <wp:docPr id="1" name="" descr="" title=""/>
+                  <wp:cNvGraphicFramePr>
+                    <a:graphicFrameLocks xmlns:a="http://schemas.openxmlformats.org/drawingml/2006/main" noChangeAspect="1"/>
+                  </wp:cNvGraphicFramePr>
+                  <a:graphic xmlns:a="http://schemas.openxmlformats.org/drawingml/2006/main">
+                    <a:graphicData uri="http://schemas.openxmlformats.org/drawingml/2006/picture">
+                      <pic:pic xmlns:pic="http://schemas.openxmlformats.org/drawingml/2006/picture">
+                        <pic:nvPicPr>
+                          <pic:cNvPr id="0" name="" descr=""/>
+                          <pic:cNvPicPr>
+                            <a:picLocks noChangeAspect="1" noChangeArrowheads="1"/>
+                          </pic:cNvPicPr>
+                        </pic:nvPicPr>
+                        <pic:blipFill>
+                          <a:blip r:embed="rId12" cstate="none"/>
+                          <a:srcRect/>
+                          <a:stretch>
+                            <a:fillRect/>
+                          </a:stretch>
+                        </pic:blipFill>
+                        <pic:spPr bwMode="auto">
+                          <a:xfrm>
+                            <a:off x="0" y="0"/>
+                            <a:ext cx="247650" cy="247650"/>
+                          </a:xfrm>
+                          <a:prstGeom prst="rect">
+                            <a:avLst/>
+                          </a:prstGeom>
+                        </pic:spPr>
+                      </pic:pic>
+                    </a:graphicData>
+                  </a:graphic>
+                </wp:inline>
+              </w:drawing>
+            </w:r>
+          </w:p>
+        </w:tc>
+        <w:tc>
+          <w:tcPr>
+            <w:tcW w:type="dxa" w:w="1002"/>
+            <w:tcBorders>
+              <w:top w:val="none" w:color="FFFFFF" w:sz="0"/>
+              <w:left w:val="single" w:color="FFFFFF" w:sz="24"/>
+              <w:bottom w:val="none" w:color="FFFFFF" w:sz="0"/>
+              <w:right w:val="single" w:color="FFFFFF" w:sz="24"/>
+            </w:tcBorders>
+            <w:shd w:fill="8A4B00" w:color="auto" w:val="clear"/>
+            <w:tcMar>
+              <w:top w:type="dxa" w:w="0"/>
+              <w:left w:type="dxa" w:w="0"/>
+              <w:bottom w:type="dxa" w:w="0"/>
+              <w:right w:type="dxa" w:w="0"/>
+            </w:tcMar>
+            <w:vAlign w:val="center"/>
+          </w:tcPr>
+          <w:p>
+            <w:pPr>
+              <w:spacing w:after="0" w:before="0"/>
+              <w:jc w:val="center"/>
+            </w:pPr>
+            <w:r>
+              <w:drawing>
+                <wp:inline distT="0" distB="0" distL="0" distR="0">
+                  <wp:extent cx="247650" cy="247650"/>
+                  <wp:effectExtent t="0" r="0" b="0" l="0"/>
+                  <wp:docPr id="1" name="" descr="" title=""/>
+                  <wp:cNvGraphicFramePr>
+                    <a:graphicFrameLocks xmlns:a="http://schemas.openxmlformats.org/drawingml/2006/main" noChangeAspect="1"/>
+                  </wp:cNvGraphicFramePr>
+                  <a:graphic xmlns:a="http://schemas.openxmlformats.org/drawingml/2006/main">
+                    <a:graphicData uri="http://schemas.openxmlformats.org/drawingml/2006/picture">
+                      <pic:pic xmlns:pic="http://schemas.openxmlformats.org/drawingml/2006/picture">
+                        <pic:nvPicPr>
+                          <pic:cNvPr id="0" name="" descr=""/>
+                          <pic:cNvPicPr>
+                            <a:picLocks noChangeAspect="1" noChangeArrowheads="1"/>
+                          </pic:cNvPicPr>
+                        </pic:nvPicPr>
+                        <pic:blipFill>
+                          <a:blip r:embed="rId13" cstate="none"/>
+                          <a:srcRect/>
+                          <a:stretch>
+                            <a:fillRect/>
+                          </a:stretch>
+                        </pic:blipFill>
+                        <pic:spPr bwMode="auto">
+                          <a:xfrm>
+                            <a:off x="0" y="0"/>
+                            <a:ext cx="247650" cy="247650"/>
+                          </a:xfrm>
+                          <a:prstGeom prst="rect">
+                            <a:avLst/>
+                          </a:prstGeom>
+                        </pic:spPr>
+                      </pic:pic>
+                    </a:graphicData>
+                  </a:graphic>
+                </wp:inline>
+              </w:drawing>
+            </w:r>
+          </w:p>
+        </w:tc>
+        <w:tc>
+          <w:tcPr>
+            <w:tcW w:type="dxa" w:w="1002"/>
+            <w:tcBorders>
+              <w:top w:val="none" w:color="FFFFFF" w:sz="0"/>
+              <w:left w:val="single" w:color="FFFFFF" w:sz="24"/>
+              <w:bottom w:val="none" w:color="FFFFFF" w:sz="0"/>
+              <w:right w:val="single" w:color="FFFFFF" w:sz="24"/>
+            </w:tcBorders>
+            <w:shd w:fill="A3271C" w:color="auto" w:val="clear"/>
+            <w:tcMar>
+              <w:top w:type="dxa" w:w="0"/>
+              <w:left w:type="dxa" w:w="0"/>
+              <w:bottom w:type="dxa" w:w="0"/>
+              <w:right w:type="dxa" w:w="0"/>
+            </w:tcMar>
+            <w:vAlign w:val="center"/>
+          </w:tcPr>
+          <w:p>
+            <w:pPr>
+              <w:spacing w:after="0" w:before="0"/>
+              <w:jc w:val="center"/>
+            </w:pPr>
+            <w:r>
+              <w:drawing>
+                <wp:inline distT="0" distB="0" distL="0" distR="0">
+                  <wp:extent cx="247650" cy="247650"/>
+                  <wp:effectExtent t="0" r="0" b="0" l="0"/>
+                  <wp:docPr id="1" name="" descr="" title=""/>
+                  <wp:cNvGraphicFramePr>
+                    <a:graphicFrameLocks xmlns:a="http://schemas.openxmlformats.org/drawingml/2006/main" noChangeAspect="1"/>
+                  </wp:cNvGraphicFramePr>
+                  <a:graphic xmlns:a="http://schemas.openxmlformats.org/drawingml/2006/main">
+                    <a:graphicData uri="http://schemas.openxmlformats.org/drawingml/2006/picture">
+                      <pic:pic xmlns:pic="http://schemas.openxmlformats.org/drawingml/2006/picture">
+                        <pic:nvPicPr>
+                          <pic:cNvPr id="0" name="" descr=""/>
+                          <pic:cNvPicPr>
+                            <a:picLocks noChangeAspect="1" noChangeArrowheads="1"/>
+                          </pic:cNvPicPr>
+                        </pic:nvPicPr>
+                        <pic:blipFill>
+                          <a:blip r:embed="rId14" cstate="none"/>
+                          <a:srcRect/>
+                          <a:stretch>
+                            <a:fillRect/>
+                          </a:stretch>
+                        </pic:blipFill>
+                        <pic:spPr bwMode="auto">
+                          <a:xfrm>
+                            <a:off x="0" y="0"/>
+                            <a:ext cx="247650" cy="247650"/>
+                          </a:xfrm>
+                          <a:prstGeom prst="rect">
+                            <a:avLst/>
+                          </a:prstGeom>
+                        </pic:spPr>
+                      </pic:pic>
+                    </a:graphicData>
+                  </a:graphic>
+                </wp:inline>
+              </w:drawing>
+            </w:r>
+          </w:p>
+        </w:tc>
+        <w:tc>
+          <w:tcPr>
+            <w:tcW w:type="dxa" w:w="1002"/>
+            <w:tcBorders>
+              <w:top w:val="none" w:color="FFFFFF" w:sz="0"/>
+              <w:left w:val="single" w:color="FFFFFF" w:sz="24"/>
+              <w:bottom w:val="none" w:color="FFFFFF" w:sz="0"/>
+              <w:right w:val="single" w:color="FFFFFF" w:sz="24"/>
+            </w:tcBorders>
+            <w:shd w:fill="8B2F62" w:color="auto" w:val="clear"/>
+            <w:tcMar>
+              <w:top w:type="dxa" w:w="0"/>
+              <w:left w:type="dxa" w:w="0"/>
+              <w:bottom w:type="dxa" w:w="0"/>
+              <w:right w:type="dxa" w:w="0"/>
+            </w:tcMar>
+            <w:vAlign w:val="center"/>
+          </w:tcPr>
+          <w:p>
+            <w:pPr>
+              <w:spacing w:after="0" w:before="0"/>
+              <w:jc w:val="center"/>
+            </w:pPr>
+            <w:r>
+              <w:drawing>
+                <wp:inline distT="0" distB="0" distL="0" distR="0">
+                  <wp:extent cx="247650" cy="247650"/>
+                  <wp:effectExtent t="0" r="0" b="0" l="0"/>
+                  <wp:docPr id="1" name="" descr="" title=""/>
+                  <wp:cNvGraphicFramePr>
+                    <a:graphicFrameLocks xmlns:a="http://schemas.openxmlformats.org/drawingml/2006/main" noChangeAspect="1"/>
+                  </wp:cNvGraphicFramePr>
+                  <a:graphic xmlns:a="http://schemas.openxmlformats.org/drawingml/2006/main">
+                    <a:graphicData uri="http://schemas.openxmlformats.org/drawingml/2006/picture">
+                      <pic:pic xmlns:pic="http://schemas.openxmlformats.org/drawingml/2006/picture">
+                        <pic:nvPicPr>
+                          <pic:cNvPr id="0" name="" descr=""/>
+                          <pic:cNvPicPr>
+                            <a:picLocks noChangeAspect="1" noChangeArrowheads="1"/>
+                          </pic:cNvPicPr>
+                        </pic:nvPicPr>
+                        <pic:blipFill>
+                          <a:blip r:embed="rId15" cstate="none"/>
+                          <a:srcRect/>
+                          <a:stretch>
+                            <a:fillRect/>
+                          </a:stretch>
+                        </pic:blipFill>
+                        <pic:spPr bwMode="auto">
+                          <a:xfrm>
+                            <a:off x="0" y="0"/>
+                            <a:ext cx="247650" cy="247650"/>
+                          </a:xfrm>
+                          <a:prstGeom prst="rect">
+                            <a:avLst/>
+                          </a:prstGeom>
+                        </pic:spPr>
+                      </pic:pic>
+                    </a:graphicData>
+                  </a:graphic>
+                </wp:inline>
+              </w:drawing>
+            </w:r>
+          </w:p>
+        </w:tc>
+        <w:tc>
+          <w:tcPr>
+            <w:tcW w:type="dxa" w:w="1002"/>
+            <w:tcBorders>
+              <w:top w:val="none" w:color="FFFFFF" w:sz="0"/>
+              <w:left w:val="single" w:color="FFFFFF" w:sz="24"/>
+              <w:bottom w:val="none" w:color="FFFFFF" w:sz="0"/>
+              <w:right w:val="single" w:color="FFFFFF" w:sz="24"/>
+            </w:tcBorders>
+            <w:shd w:fill="5A3486" w:color="auto" w:val="clear"/>
+            <w:tcMar>
+              <w:top w:type="dxa" w:w="0"/>
+              <w:left w:type="dxa" w:w="0"/>
+              <w:bottom w:type="dxa" w:w="0"/>
+              <w:right w:type="dxa" w:w="0"/>
+            </w:tcMar>
+            <w:vAlign w:val="center"/>
+          </w:tcPr>
+          <w:p>
+            <w:pPr>
+              <w:spacing w:after="0" w:before="0"/>
+              <w:jc w:val="center"/>
+            </w:pPr>
+            <w:r>
+              <w:drawing>
+                <wp:inline distT="0" distB="0" distL="0" distR="0">
+                  <wp:extent cx="247650" cy="247650"/>
+                  <wp:effectExtent t="0" r="0" b="0" l="0"/>
+                  <wp:docPr id="1" name="" descr="" title=""/>
+                  <wp:cNvGraphicFramePr>
+                    <a:graphicFrameLocks xmlns:a="http://schemas.openxmlformats.org/drawingml/2006/main" noChangeAspect="1"/>
+                  </wp:cNvGraphicFramePr>
+                  <a:graphic xmlns:a="http://schemas.openxmlformats.org/drawingml/2006/main">
+                    <a:graphicData uri="http://schemas.openxmlformats.org/drawingml/2006/picture">
+                      <pic:pic xmlns:pic="http://schemas.openxmlformats.org/drawingml/2006/picture">
+                        <pic:nvPicPr>
+                          <pic:cNvPr id="0" name="" descr=""/>
+                          <pic:cNvPicPr>
+                            <a:picLocks noChangeAspect="1" noChangeArrowheads="1"/>
+                          </pic:cNvPicPr>
+                        </pic:nvPicPr>
+                        <pic:blipFill>
+                          <a:blip r:embed="rId16" cstate="none"/>
+                          <a:srcRect/>
+                          <a:stretch>
+                            <a:fillRect/>
+                          </a:stretch>
+                        </pic:blipFill>
+                        <pic:spPr bwMode="auto">
+                          <a:xfrm>
+                            <a:off x="0" y="0"/>
+                            <a:ext cx="247650" cy="247650"/>
+                          </a:xfrm>
+                          <a:prstGeom prst="rect">
+                            <a:avLst/>
+                          </a:prstGeom>
+                        </pic:spPr>
+                      </pic:pic>
+                    </a:graphicData>
+                  </a:graphic>
+                </wp:inline>
+              </w:drawing>
+            </w:r>
+          </w:p>
+        </w:tc>
+        <w:tc>
+          <w:tcPr>
+            <w:tcW w:type="dxa" w:w="1002"/>
+            <w:tcBorders>
+              <w:top w:val="none" w:color="FFFFFF" w:sz="0"/>
+              <w:left w:val="single" w:color="FFFFFF" w:sz="24"/>
+              <w:bottom w:val="none" w:color="FFFFFF" w:sz="0"/>
+              <w:right w:val="single" w:color="FFFFFF" w:sz="24"/>
+            </w:tcBorders>
+            <w:shd w:fill="0F5F86" w:color="auto" w:val="clear"/>
+            <w:tcMar>
+              <w:top w:type="dxa" w:w="0"/>
+              <w:left w:type="dxa" w:w="0"/>
+              <w:bottom w:type="dxa" w:w="0"/>
+              <w:right w:type="dxa" w:w="0"/>
+            </w:tcMar>
+            <w:vAlign w:val="center"/>
+          </w:tcPr>
+          <w:p>
+            <w:pPr>
+              <w:spacing w:after="0" w:before="0"/>
+              <w:jc w:val="center"/>
+            </w:pPr>
+            <w:r>
+              <w:drawing>
+                <wp:inline distT="0" distB="0" distL="0" distR="0">
+                  <wp:extent cx="247650" cy="247650"/>
+                  <wp:effectExtent t="0" r="0" b="0" l="0"/>
+                  <wp:docPr id="1" name="" descr="" title=""/>
+                  <wp:cNvGraphicFramePr>
+                    <a:graphicFrameLocks xmlns:a="http://schemas.openxmlformats.org/drawingml/2006/main" noChangeAspect="1"/>
+                  </wp:cNvGraphicFramePr>
+                  <a:graphic xmlns:a="http://schemas.openxmlformats.org/drawingml/2006/main">
+                    <a:graphicData uri="http://schemas.openxmlformats.org/drawingml/2006/picture">
+                      <pic:pic xmlns:pic="http://schemas.openxmlformats.org/drawingml/2006/picture">
+                        <pic:nvPicPr>
+                          <pic:cNvPr id="0" name="" descr=""/>
+                          <pic:cNvPicPr>
+                            <a:picLocks noChangeAspect="1" noChangeArrowheads="1"/>
+                          </pic:cNvPicPr>
+                        </pic:nvPicPr>
+                        <pic:blipFill>
+                          <a:blip r:embed="rId17" cstate="none"/>
+                          <a:srcRect/>
+                          <a:stretch>
+                            <a:fillRect/>
+                          </a:stretch>
+                        </pic:blipFill>
+                        <pic:spPr bwMode="auto">
+                          <a:xfrm>
+                            <a:off x="0" y="0"/>
+                            <a:ext cx="247650" cy="247650"/>
+                          </a:xfrm>
+                          <a:prstGeom prst="rect">
+                            <a:avLst/>
+                          </a:prstGeom>
+                        </pic:spPr>
+                      </pic:pic>
+                    </a:graphicData>
+                  </a:graphic>
+                </wp:inline>
+              </w:drawing>
+            </w:r>
+          </w:p>
+        </w:tc>
+        <w:tc>
+          <w:tcPr>
+            <w:tcW w:type="dxa" w:w="1002"/>
+            <w:tcBorders>
+              <w:top w:val="none" w:color="FFFFFF" w:sz="0"/>
+              <w:left w:val="single" w:color="FFFFFF" w:sz="24"/>
+              <w:bottom w:val="none" w:color="FFFFFF" w:sz="0"/>
+              <w:right w:val="single" w:color="FFFFFF" w:sz="24"/>
+            </w:tcBorders>
+            <w:shd w:fill="2D6A2E" w:color="auto" w:val="clear"/>
+            <w:tcMar>
+              <w:top w:type="dxa" w:w="0"/>
+              <w:left w:type="dxa" w:w="0"/>
+              <w:bottom w:type="dxa" w:w="0"/>
+              <w:right w:type="dxa" w:w="0"/>
+            </w:tcMar>
+            <w:vAlign w:val="center"/>
+          </w:tcPr>
+          <w:p>
+            <w:pPr>
+              <w:spacing w:after="0" w:before="0"/>
+              <w:jc w:val="center"/>
+            </w:pPr>
+            <w:r>
+              <w:drawing>
+                <wp:inline distT="0" distB="0" distL="0" distR="0">
+                  <wp:extent cx="247650" cy="247650"/>
+                  <wp:effectExtent t="0" r="0" b="0" l="0"/>
+                  <wp:docPr id="1" name="" descr="" title=""/>
+                  <wp:cNvGraphicFramePr>
+                    <a:graphicFrameLocks xmlns:a="http://schemas.openxmlformats.org/drawingml/2006/main" noChangeAspect="1"/>
+                  </wp:cNvGraphicFramePr>
+                  <a:graphic xmlns:a="http://schemas.openxmlformats.org/drawingml/2006/main">
+                    <a:graphicData uri="http://schemas.openxmlformats.org/drawingml/2006/picture">
+                      <pic:pic xmlns:pic="http://schemas.openxmlformats.org/drawingml/2006/picture">
+                        <pic:nvPicPr>
+                          <pic:cNvPr id="0" name="" descr=""/>
+                          <pic:cNvPicPr>
+                            <a:picLocks noChangeAspect="1" noChangeArrowheads="1"/>
+                          </pic:cNvPicPr>
+                        </pic:nvPicPr>
+                        <pic:blipFill>
+                          <a:blip r:embed="rId18" cstate="none"/>
+                          <a:srcRect/>
+                          <a:stretch>
+                            <a:fillRect/>
+                          </a:stretch>
+                        </pic:blipFill>
+                        <pic:spPr bwMode="auto">
+                          <a:xfrm>
+                            <a:off x="0" y="0"/>
+                            <a:ext cx="247650" cy="247650"/>
+                          </a:xfrm>
+                          <a:prstGeom prst="rect">
+                            <a:avLst/>
+                          </a:prstGeom>
+                        </pic:spPr>
+                      </pic:pic>
+                    </a:graphicData>
+                  </a:graphic>
+                </wp:inline>
+              </w:drawing>
+            </w:r>
+          </w:p>
+        </w:tc>
+        <w:tc>
+          <w:tcPr>
+            <w:tcW w:type="dxa" w:w="1002"/>
+            <w:tcBorders>
+              <w:top w:val="none" w:color="FFFFFF" w:sz="0"/>
+              <w:left w:val="single" w:color="FFFFFF" w:sz="24"/>
+              <w:bottom w:val="none" w:color="FFFFFF" w:sz="0"/>
+              <w:right w:val="none" w:color="FFFFFF" w:sz="0"/>
+            </w:tcBorders>
+            <w:shd w:fill="3F4B5E" w:color="auto" w:val="clear"/>
+            <w:tcMar>
+              <w:top w:type="dxa" w:w="0"/>
+              <w:left w:type="dxa" w:w="0"/>
+              <w:bottom w:type="dxa" w:w="0"/>
+              <w:right w:type="dxa" w:w="0"/>
+            </w:tcMar>
+            <w:vAlign w:val="center"/>
+          </w:tcPr>
+          <w:p>
+            <w:pPr>
+              <w:spacing w:after="0" w:before="0"/>
+              <w:jc w:val="center"/>
+            </w:pPr>
+            <w:r>
+              <w:drawing>
+                <wp:inline distT="0" distB="0" distL="0" distR="0">
+                  <wp:extent cx="247650" cy="247650"/>
+                  <wp:effectExtent t="0" r="0" b="0" l="0"/>
+                  <wp:docPr id="1" name="" descr="" title=""/>
+                  <wp:cNvGraphicFramePr>
+                    <a:graphicFrameLocks xmlns:a="http://schemas.openxmlformats.org/drawingml/2006/main" noChangeAspect="1"/>
+                  </wp:cNvGraphicFramePr>
+                  <a:graphic xmlns:a="http://schemas.openxmlformats.org/drawingml/2006/main">
+                    <a:graphicData uri="http://schemas.openxmlformats.org/drawingml/2006/picture">
+                      <pic:pic xmlns:pic="http://schemas.openxmlformats.org/drawingml/2006/picture">
+                        <pic:nvPicPr>
+                          <pic:cNvPr id="0" name="" descr=""/>
+                          <pic:cNvPicPr>
+                            <a:picLocks noChangeAspect="1" noChangeArrowheads="1"/>
+                          </pic:cNvPicPr>
+                        </pic:nvPicPr>
+                        <pic:blipFill>
+                          <a:blip r:embed="rId19" cstate="none"/>
+                          <a:srcRect/>
+                          <a:stretch>
+                            <a:fillRect/>
+                          </a:stretch>
+                        </pic:blipFill>
+                        <pic:spPr bwMode="auto">
+                          <a:xfrm>
+                            <a:off x="0" y="0"/>
+                            <a:ext cx="247650" cy="247650"/>
+                          </a:xfrm>
+                          <a:prstGeom prst="rect">
+                            <a:avLst/>
+                          </a:prstGeom>
+                        </pic:spPr>
+                      </pic:pic>
+                    </a:graphicData>
+                  </a:graphic>
+                </wp:inline>
+              </w:drawing>
+            </w:r>
+          </w:p>
+        </w:tc>
+      </w:tr>
+    </w:tbl>
     <w:p>
       <w:pPr>
         <w:pStyle w:val="PortadaAntetitulo"/>
@@ -20,6 +636,11 @@
     </w:p>
     <w:p>
       <w:pPr>
+        <w:pStyle w:val="PortadaRaya"/>
+      </w:pPr>
+    </w:p>
+    <w:p>
+      <w:pPr>
         <w:pStyle w:val="PortadaSubtitulo"/>
       </w:pPr>
       <w:r>
@@ -36,6 +657,11 @@
     </w:p>
     <w:p>
       <w:pPr>
+        <w:spacing w:after="0" w:before="4300"/>
+      </w:pPr>
+    </w:p>
+    <w:p>
+      <w:pPr>
         <w:pStyle w:val="Cinta"/>
       </w:pPr>
       <w:r>
@@ -44,6 +670,42 @@
     </w:p>
     <w:p>
       <w:pPr>
+        <w:pStyle w:val="PortadaCreditos"/>
+        <w:pBdr>
+          <w:top w:val="dashed" w:color="6F7F99" w:sz="4" w:space="1"/>
+          <w:left w:val="dashed" w:color="6F7F99" w:sz="4" w:space="4"/>
+          <w:bottom w:val="dashed" w:color="6F7F99" w:sz="4" w:space="1"/>
+          <w:right w:val="dashed" w:color="6F7F99" w:sz="4" w:space="4"/>
+        </w:pBdr>
+      </w:pPr>
+      <w:r>
+        <w:rPr>
+          <w:i/>
+          <w:iCs/>
+        </w:rPr>
+        <w:t xml:space="preserve">[Autoría: nombre y apellido de cada autor]</w:t>
+      </w:r>
+    </w:p>
+    <w:p>
+      <w:pPr>
+        <w:pStyle w:val="PortadaCreditos"/>
+        <w:pBdr>
+          <w:top w:val="dashed" w:color="6F7F99" w:sz="4" w:space="1"/>
+          <w:left w:val="dashed" w:color="6F7F99" w:sz="4" w:space="4"/>
+          <w:bottom w:val="dashed" w:color="6F7F99" w:sz="4" w:space="1"/>
+          <w:right w:val="dashed" w:color="6F7F99" w:sz="4" w:space="4"/>
+        </w:pBdr>
+      </w:pPr>
+      <w:r>
+        <w:rPr>
+          <w:i/>
+          <w:iCs/>
+        </w:rPr>
+        <w:t xml:space="preserve">[Institución o unidad académica]</w:t>
+      </w:r>
+    </w:p>
+    <w:p>
+      <w:pPr>
         <w:pStyle w:val="PortadaDatos"/>
       </w:pPr>
       <w:r>
@@ -63,7 +725,7 @@
         <w:pStyle w:val="PortadaDatos"/>
       </w:pPr>
       <w:r>
-        <w:t xml:space="preserve">Año [aaaa]</w:t>
+        <w:t xml:space="preserve">[Edición] · [Ciudad] · [aaaa]</w:t>
       </w:r>
     </w:p>
     <w:p>
@@ -1614,7 +2276,7 @@
                           </pic:cNvPicPr>
                         </pic:nvPicPr>
                         <pic:blipFill>
-                          <a:blip r:embed="rId13" cstate="none"/>
+                          <a:blip r:embed="rId20" cstate="none"/>
                           <a:srcRect/>
                           <a:stretch>
                             <a:fillRect/>
@@ -1757,7 +2419,7 @@
                           </pic:cNvPicPr>
                         </pic:nvPicPr>
                         <pic:blipFill>
-                          <a:blip r:embed="rId14" cstate="none"/>
+                          <a:blip r:embed="rId21" cstate="none"/>
                           <a:srcRect/>
                           <a:stretch>
                             <a:fillRect/>
@@ -1930,7 +2592,7 @@
                           </pic:cNvPicPr>
                         </pic:nvPicPr>
                         <pic:blipFill>
-                          <a:blip r:embed="rId15" cstate="none"/>
+                          <a:blip r:embed="rId22" cstate="none"/>
                           <a:srcRect/>
                           <a:stretch>
                             <a:fillRect/>
@@ -2108,7 +2770,7 @@
                           </pic:cNvPicPr>
                         </pic:nvPicPr>
                         <pic:blipFill>
-                          <a:blip r:embed="rId16" cstate="none"/>
+                          <a:blip r:embed="rId23" cstate="none"/>
                           <a:srcRect/>
                           <a:stretch>
                             <a:fillRect/>
@@ -2289,7 +2951,7 @@
                           </pic:cNvPicPr>
                         </pic:nvPicPr>
                         <pic:blipFill>
-                          <a:blip r:embed="rId17" cstate="none"/>
+                          <a:blip r:embed="rId24" cstate="none"/>
                           <a:srcRect/>
                           <a:stretch>
                             <a:fillRect/>
@@ -2470,7 +3132,7 @@
                           </pic:cNvPicPr>
                         </pic:nvPicPr>
                         <pic:blipFill>
-                          <a:blip r:embed="rId18" cstate="none"/>
+                          <a:blip r:embed="rId25" cstate="none"/>
                           <a:srcRect/>
                           <a:stretch>
                             <a:fillRect/>
@@ -2631,7 +3293,7 @@
                           </pic:cNvPicPr>
                         </pic:nvPicPr>
                         <pic:blipFill>
-                          <a:blip r:embed="rId19" cstate="none"/>
+                          <a:blip r:embed="rId26" cstate="none"/>
                           <a:srcRect/>
                           <a:stretch>
                             <a:fillRect/>
@@ -3640,7 +4302,7 @@
                           </pic:cNvPicPr>
                         </pic:nvPicPr>
                         <pic:blipFill>
-                          <a:blip r:embed="rId16" cstate="none"/>
+                          <a:blip r:embed="rId23" cstate="none"/>
                           <a:srcRect/>
                           <a:stretch>
                             <a:fillRect/>
@@ -3795,7 +4457,7 @@
                           </pic:cNvPicPr>
                         </pic:nvPicPr>
                         <pic:blipFill>
-                          <a:blip r:embed="rId17" cstate="none"/>
+                          <a:blip r:embed="rId24" cstate="none"/>
                           <a:srcRect/>
                           <a:stretch>
                             <a:fillRect/>
@@ -3950,7 +4612,7 @@
                           </pic:cNvPicPr>
                         </pic:nvPicPr>
                         <pic:blipFill>
-                          <a:blip r:embed="rId18" cstate="none"/>
+                          <a:blip r:embed="rId25" cstate="none"/>
                           <a:srcRect/>
                           <a:stretch>
                             <a:fillRect/>
@@ -4468,7 +5130,7 @@
                           </pic:cNvPicPr>
                         </pic:nvPicPr>
                         <pic:blipFill>
-                          <a:blip r:embed="rId19" cstate="none"/>
+                          <a:blip r:embed="rId26" cstate="none"/>
                           <a:srcRect/>
                           <a:stretch>
                             <a:fillRect/>
@@ -5475,8 +6137,8 @@
     <w:next w:val="Normal"/>
     <w:qFormat/>
     <w:pPr>
-      <w:spacing w:after="240" w:before="2400"/>
-      <w:jc w:val="center"/>
+      <w:spacing w:after="160" w:before="720"/>
+      <w:jc w:val="left"/>
     </w:pPr>
     <w:rPr>
       <w:rFonts w:ascii="Calibri" w:cs="Calibri" w:eastAsia="Calibri" w:hAnsi="Calibri"/>
@@ -5495,8 +6157,9 @@
     <w:next w:val="Normal"/>
     <w:qFormat/>
     <w:pPr>
-      <w:spacing w:after="240" w:line="264"/>
-      <w:jc w:val="center"/>
+      <w:spacing w:after="360" w:line="264"/>
+      <w:ind w:right="2880"/>
+      <w:jc w:val="left"/>
     </w:pPr>
     <w:rPr>
       <w:rFonts w:ascii="Calibri" w:cs="Calibri" w:eastAsia="Calibri" w:hAnsi="Calibri"/>
@@ -5514,7 +6177,7 @@
     <w:qFormat/>
     <w:pPr>
       <w:spacing w:after="120"/>
-      <w:jc w:val="center"/>
+      <w:jc w:val="left"/>
     </w:pPr>
     <w:rPr>
       <w:rFonts w:ascii="Cambria" w:cs="Cambria" w:eastAsia="Cambria" w:hAnsi="Cambria"/>
@@ -5525,14 +6188,33 @@
       <w:szCs w:val="28"/>
     </w:rPr>
   </w:style>
+  <w:style w:type="paragraph" w:styleId="PortadaRaya">
+    <w:name w:val="Portada – raya bajo el título"/>
+    <w:basedOn w:val="Normal"/>
+    <w:next w:val="Normal"/>
+    <w:qFormat/>
+    <w:pPr>
+      <w:pBdr>
+        <w:top w:val="single" w:color="2E5496" w:sz="24" w:space="0"/>
+      </w:pBdr>
+      <w:spacing w:after="300" w:before="0"/>
+      <w:ind w:right="8226"/>
+      <w:jc w:val="left"/>
+    </w:pPr>
+    <w:rPr>
+      <w:rFonts w:ascii="Calibri" w:cs="Calibri" w:eastAsia="Calibri" w:hAnsi="Calibri"/>
+      <w:sz w:val="8"/>
+      <w:szCs w:val="8"/>
+    </w:rPr>
+  </w:style>
   <w:style w:type="paragraph" w:styleId="PortadaLema">
     <w:name w:val="Portada – descripción"/>
     <w:basedOn w:val="Normal"/>
     <w:next w:val="Normal"/>
     <w:qFormat/>
     <w:pPr>
-      <w:spacing w:after="600"/>
-      <w:jc w:val="center"/>
+      <w:spacing w:after="0"/>
+      <w:jc w:val="left"/>
     </w:pPr>
     <w:rPr>
       <w:rFonts w:ascii="Cambria" w:cs="Cambria" w:eastAsia="Cambria" w:hAnsi="Cambria"/>
@@ -5551,14 +6233,30 @@
         <w:top w:val="single" w:color="1F3864" w:sz="8" w:space="6"/>
         <w:bottom w:val="single" w:color="1F3864" w:sz="8" w:space="6"/>
       </w:pBdr>
-      <w:spacing w:after="600" w:before="0" w:line="276"/>
-      <w:jc w:val="center"/>
+      <w:spacing w:after="360" w:before="0" w:line="276"/>
+      <w:jc w:val="left"/>
     </w:pPr>
     <w:rPr>
       <w:rFonts w:ascii="Calibri" w:cs="Calibri" w:eastAsia="Calibri" w:hAnsi="Calibri"/>
       <w:color w:val="1F3864"/>
       <w:sz w:val="21"/>
       <w:szCs w:val="21"/>
+    </w:rPr>
+  </w:style>
+  <w:style w:type="paragraph" w:styleId="PortadaCreditos">
+    <w:name w:val="Portada – créditos"/>
+    <w:basedOn w:val="Normal"/>
+    <w:next w:val="Normal"/>
+    <w:qFormat/>
+    <w:pPr>
+      <w:spacing w:after="60"/>
+      <w:jc w:val="left"/>
+    </w:pPr>
+    <w:rPr>
+      <w:rFonts w:ascii="Calibri" w:cs="Calibri" w:eastAsia="Calibri" w:hAnsi="Calibri"/>
+      <w:color w:val="1B1F27"/>
+      <w:sz w:val="22"/>
+      <w:szCs w:val="22"/>
     </w:rPr>
   </w:style>
   <w:style w:type="paragraph" w:styleId="PortadaDatos">
@@ -5568,7 +6266,7 @@
     <w:qFormat/>
     <w:pPr>
       <w:spacing w:after="60"/>
-      <w:jc w:val="center"/>
+      <w:jc w:val="left"/>
     </w:pPr>
     <w:rPr>
       <w:rFonts w:ascii="Cambria" w:cs="Cambria" w:eastAsia="Cambria" w:hAnsi="Cambria"/>

</xml_diff>

<commit_message>
Cover mosaic: plain coloured squares, no icons
The nine cells of the mosaic cover (HTML and Word) are now plain squares
in the box colours. The white icons added for the Word cover are removed
again; only the two opening-family ones remain, for box headers.

Co-Authored-By: Claude Opus 5.5 <noreply@anthropic.com>
</commit_message>
<xml_diff>
--- a/didactica-design-system/templates/Didactica-Universitaria-muestra.docx
+++ b/didactica-design-system/templates/Didactica-Universitaria-muestra.docx
@@ -52,48 +52,7 @@
           <w:p>
             <w:pPr>
               <w:spacing w:after="0" w:before="0"/>
-              <w:jc w:val="center"/>
-            </w:pPr>
-            <w:r>
-              <w:drawing>
-                <wp:inline distT="0" distB="0" distL="0" distR="0">
-                  <wp:extent cx="247650" cy="247650"/>
-                  <wp:effectExtent t="0" r="0" b="0" l="0"/>
-                  <wp:docPr id="1" name="" descr="" title=""/>
-                  <wp:cNvGraphicFramePr>
-                    <a:graphicFrameLocks xmlns:a="http://schemas.openxmlformats.org/drawingml/2006/main" noChangeAspect="1"/>
-                  </wp:cNvGraphicFramePr>
-                  <a:graphic xmlns:a="http://schemas.openxmlformats.org/drawingml/2006/main">
-                    <a:graphicData uri="http://schemas.openxmlformats.org/drawingml/2006/picture">
-                      <pic:pic xmlns:pic="http://schemas.openxmlformats.org/drawingml/2006/picture">
-                        <pic:nvPicPr>
-                          <pic:cNvPr id="0" name="" descr=""/>
-                          <pic:cNvPicPr>
-                            <a:picLocks noChangeAspect="1" noChangeArrowheads="1"/>
-                          </pic:cNvPicPr>
-                        </pic:nvPicPr>
-                        <pic:blipFill>
-                          <a:blip r:embed="rId11" cstate="none"/>
-                          <a:srcRect/>
-                          <a:stretch>
-                            <a:fillRect/>
-                          </a:stretch>
-                        </pic:blipFill>
-                        <pic:spPr bwMode="auto">
-                          <a:xfrm>
-                            <a:off x="0" y="0"/>
-                            <a:ext cx="247650" cy="247650"/>
-                          </a:xfrm>
-                          <a:prstGeom prst="rect">
-                            <a:avLst/>
-                          </a:prstGeom>
-                        </pic:spPr>
-                      </pic:pic>
-                    </a:graphicData>
-                  </a:graphic>
-                </wp:inline>
-              </w:drawing>
-            </w:r>
+            </w:pPr>
           </w:p>
         </w:tc>
         <w:tc>
@@ -117,48 +76,7 @@
           <w:p>
             <w:pPr>
               <w:spacing w:after="0" w:before="0"/>
-              <w:jc w:val="center"/>
-            </w:pPr>
-            <w:r>
-              <w:drawing>
-                <wp:inline distT="0" distB="0" distL="0" distR="0">
-                  <wp:extent cx="247650" cy="247650"/>
-                  <wp:effectExtent t="0" r="0" b="0" l="0"/>
-                  <wp:docPr id="1" name="" descr="" title=""/>
-                  <wp:cNvGraphicFramePr>
-                    <a:graphicFrameLocks xmlns:a="http://schemas.openxmlformats.org/drawingml/2006/main" noChangeAspect="1"/>
-                  </wp:cNvGraphicFramePr>
-                  <a:graphic xmlns:a="http://schemas.openxmlformats.org/drawingml/2006/main">
-                    <a:graphicData uri="http://schemas.openxmlformats.org/drawingml/2006/picture">
-                      <pic:pic xmlns:pic="http://schemas.openxmlformats.org/drawingml/2006/picture">
-                        <pic:nvPicPr>
-                          <pic:cNvPr id="0" name="" descr=""/>
-                          <pic:cNvPicPr>
-                            <a:picLocks noChangeAspect="1" noChangeArrowheads="1"/>
-                          </pic:cNvPicPr>
-                        </pic:nvPicPr>
-                        <pic:blipFill>
-                          <a:blip r:embed="rId12" cstate="none"/>
-                          <a:srcRect/>
-                          <a:stretch>
-                            <a:fillRect/>
-                          </a:stretch>
-                        </pic:blipFill>
-                        <pic:spPr bwMode="auto">
-                          <a:xfrm>
-                            <a:off x="0" y="0"/>
-                            <a:ext cx="247650" cy="247650"/>
-                          </a:xfrm>
-                          <a:prstGeom prst="rect">
-                            <a:avLst/>
-                          </a:prstGeom>
-                        </pic:spPr>
-                      </pic:pic>
-                    </a:graphicData>
-                  </a:graphic>
-                </wp:inline>
-              </w:drawing>
-            </w:r>
+            </w:pPr>
           </w:p>
         </w:tc>
         <w:tc>
@@ -182,48 +100,7 @@
           <w:p>
             <w:pPr>
               <w:spacing w:after="0" w:before="0"/>
-              <w:jc w:val="center"/>
-            </w:pPr>
-            <w:r>
-              <w:drawing>
-                <wp:inline distT="0" distB="0" distL="0" distR="0">
-                  <wp:extent cx="247650" cy="247650"/>
-                  <wp:effectExtent t="0" r="0" b="0" l="0"/>
-                  <wp:docPr id="1" name="" descr="" title=""/>
-                  <wp:cNvGraphicFramePr>
-                    <a:graphicFrameLocks xmlns:a="http://schemas.openxmlformats.org/drawingml/2006/main" noChangeAspect="1"/>
-                  </wp:cNvGraphicFramePr>
-                  <a:graphic xmlns:a="http://schemas.openxmlformats.org/drawingml/2006/main">
-                    <a:graphicData uri="http://schemas.openxmlformats.org/drawingml/2006/picture">
-                      <pic:pic xmlns:pic="http://schemas.openxmlformats.org/drawingml/2006/picture">
-                        <pic:nvPicPr>
-                          <pic:cNvPr id="0" name="" descr=""/>
-                          <pic:cNvPicPr>
-                            <a:picLocks noChangeAspect="1" noChangeArrowheads="1"/>
-                          </pic:cNvPicPr>
-                        </pic:nvPicPr>
-                        <pic:blipFill>
-                          <a:blip r:embed="rId13" cstate="none"/>
-                          <a:srcRect/>
-                          <a:stretch>
-                            <a:fillRect/>
-                          </a:stretch>
-                        </pic:blipFill>
-                        <pic:spPr bwMode="auto">
-                          <a:xfrm>
-                            <a:off x="0" y="0"/>
-                            <a:ext cx="247650" cy="247650"/>
-                          </a:xfrm>
-                          <a:prstGeom prst="rect">
-                            <a:avLst/>
-                          </a:prstGeom>
-                        </pic:spPr>
-                      </pic:pic>
-                    </a:graphicData>
-                  </a:graphic>
-                </wp:inline>
-              </w:drawing>
-            </w:r>
+            </w:pPr>
           </w:p>
         </w:tc>
         <w:tc>
@@ -247,48 +124,7 @@
           <w:p>
             <w:pPr>
               <w:spacing w:after="0" w:before="0"/>
-              <w:jc w:val="center"/>
-            </w:pPr>
-            <w:r>
-              <w:drawing>
-                <wp:inline distT="0" distB="0" distL="0" distR="0">
-                  <wp:extent cx="247650" cy="247650"/>
-                  <wp:effectExtent t="0" r="0" b="0" l="0"/>
-                  <wp:docPr id="1" name="" descr="" title=""/>
-                  <wp:cNvGraphicFramePr>
-                    <a:graphicFrameLocks xmlns:a="http://schemas.openxmlformats.org/drawingml/2006/main" noChangeAspect="1"/>
-                  </wp:cNvGraphicFramePr>
-                  <a:graphic xmlns:a="http://schemas.openxmlformats.org/drawingml/2006/main">
-                    <a:graphicData uri="http://schemas.openxmlformats.org/drawingml/2006/picture">
-                      <pic:pic xmlns:pic="http://schemas.openxmlformats.org/drawingml/2006/picture">
-                        <pic:nvPicPr>
-                          <pic:cNvPr id="0" name="" descr=""/>
-                          <pic:cNvPicPr>
-                            <a:picLocks noChangeAspect="1" noChangeArrowheads="1"/>
-                          </pic:cNvPicPr>
-                        </pic:nvPicPr>
-                        <pic:blipFill>
-                          <a:blip r:embed="rId14" cstate="none"/>
-                          <a:srcRect/>
-                          <a:stretch>
-                            <a:fillRect/>
-                          </a:stretch>
-                        </pic:blipFill>
-                        <pic:spPr bwMode="auto">
-                          <a:xfrm>
-                            <a:off x="0" y="0"/>
-                            <a:ext cx="247650" cy="247650"/>
-                          </a:xfrm>
-                          <a:prstGeom prst="rect">
-                            <a:avLst/>
-                          </a:prstGeom>
-                        </pic:spPr>
-                      </pic:pic>
-                    </a:graphicData>
-                  </a:graphic>
-                </wp:inline>
-              </w:drawing>
-            </w:r>
+            </w:pPr>
           </w:p>
         </w:tc>
         <w:tc>
@@ -312,48 +148,7 @@
           <w:p>
             <w:pPr>
               <w:spacing w:after="0" w:before="0"/>
-              <w:jc w:val="center"/>
-            </w:pPr>
-            <w:r>
-              <w:drawing>
-                <wp:inline distT="0" distB="0" distL="0" distR="0">
-                  <wp:extent cx="247650" cy="247650"/>
-                  <wp:effectExtent t="0" r="0" b="0" l="0"/>
-                  <wp:docPr id="1" name="" descr="" title=""/>
-                  <wp:cNvGraphicFramePr>
-                    <a:graphicFrameLocks xmlns:a="http://schemas.openxmlformats.org/drawingml/2006/main" noChangeAspect="1"/>
-                  </wp:cNvGraphicFramePr>
-                  <a:graphic xmlns:a="http://schemas.openxmlformats.org/drawingml/2006/main">
-                    <a:graphicData uri="http://schemas.openxmlformats.org/drawingml/2006/picture">
-                      <pic:pic xmlns:pic="http://schemas.openxmlformats.org/drawingml/2006/picture">
-                        <pic:nvPicPr>
-                          <pic:cNvPr id="0" name="" descr=""/>
-                          <pic:cNvPicPr>
-                            <a:picLocks noChangeAspect="1" noChangeArrowheads="1"/>
-                          </pic:cNvPicPr>
-                        </pic:nvPicPr>
-                        <pic:blipFill>
-                          <a:blip r:embed="rId15" cstate="none"/>
-                          <a:srcRect/>
-                          <a:stretch>
-                            <a:fillRect/>
-                          </a:stretch>
-                        </pic:blipFill>
-                        <pic:spPr bwMode="auto">
-                          <a:xfrm>
-                            <a:off x="0" y="0"/>
-                            <a:ext cx="247650" cy="247650"/>
-                          </a:xfrm>
-                          <a:prstGeom prst="rect">
-                            <a:avLst/>
-                          </a:prstGeom>
-                        </pic:spPr>
-                      </pic:pic>
-                    </a:graphicData>
-                  </a:graphic>
-                </wp:inline>
-              </w:drawing>
-            </w:r>
+            </w:pPr>
           </w:p>
         </w:tc>
         <w:tc>
@@ -377,48 +172,7 @@
           <w:p>
             <w:pPr>
               <w:spacing w:after="0" w:before="0"/>
-              <w:jc w:val="center"/>
-            </w:pPr>
-            <w:r>
-              <w:drawing>
-                <wp:inline distT="0" distB="0" distL="0" distR="0">
-                  <wp:extent cx="247650" cy="247650"/>
-                  <wp:effectExtent t="0" r="0" b="0" l="0"/>
-                  <wp:docPr id="1" name="" descr="" title=""/>
-                  <wp:cNvGraphicFramePr>
-                    <a:graphicFrameLocks xmlns:a="http://schemas.openxmlformats.org/drawingml/2006/main" noChangeAspect="1"/>
-                  </wp:cNvGraphicFramePr>
-                  <a:graphic xmlns:a="http://schemas.openxmlformats.org/drawingml/2006/main">
-                    <a:graphicData uri="http://schemas.openxmlformats.org/drawingml/2006/picture">
-                      <pic:pic xmlns:pic="http://schemas.openxmlformats.org/drawingml/2006/picture">
-                        <pic:nvPicPr>
-                          <pic:cNvPr id="0" name="" descr=""/>
-                          <pic:cNvPicPr>
-                            <a:picLocks noChangeAspect="1" noChangeArrowheads="1"/>
-                          </pic:cNvPicPr>
-                        </pic:nvPicPr>
-                        <pic:blipFill>
-                          <a:blip r:embed="rId16" cstate="none"/>
-                          <a:srcRect/>
-                          <a:stretch>
-                            <a:fillRect/>
-                          </a:stretch>
-                        </pic:blipFill>
-                        <pic:spPr bwMode="auto">
-                          <a:xfrm>
-                            <a:off x="0" y="0"/>
-                            <a:ext cx="247650" cy="247650"/>
-                          </a:xfrm>
-                          <a:prstGeom prst="rect">
-                            <a:avLst/>
-                          </a:prstGeom>
-                        </pic:spPr>
-                      </pic:pic>
-                    </a:graphicData>
-                  </a:graphic>
-                </wp:inline>
-              </w:drawing>
-            </w:r>
+            </w:pPr>
           </w:p>
         </w:tc>
         <w:tc>
@@ -442,48 +196,7 @@
           <w:p>
             <w:pPr>
               <w:spacing w:after="0" w:before="0"/>
-              <w:jc w:val="center"/>
-            </w:pPr>
-            <w:r>
-              <w:drawing>
-                <wp:inline distT="0" distB="0" distL="0" distR="0">
-                  <wp:extent cx="247650" cy="247650"/>
-                  <wp:effectExtent t="0" r="0" b="0" l="0"/>
-                  <wp:docPr id="1" name="" descr="" title=""/>
-                  <wp:cNvGraphicFramePr>
-                    <a:graphicFrameLocks xmlns:a="http://schemas.openxmlformats.org/drawingml/2006/main" noChangeAspect="1"/>
-                  </wp:cNvGraphicFramePr>
-                  <a:graphic xmlns:a="http://schemas.openxmlformats.org/drawingml/2006/main">
-                    <a:graphicData uri="http://schemas.openxmlformats.org/drawingml/2006/picture">
-                      <pic:pic xmlns:pic="http://schemas.openxmlformats.org/drawingml/2006/picture">
-                        <pic:nvPicPr>
-                          <pic:cNvPr id="0" name="" descr=""/>
-                          <pic:cNvPicPr>
-                            <a:picLocks noChangeAspect="1" noChangeArrowheads="1"/>
-                          </pic:cNvPicPr>
-                        </pic:nvPicPr>
-                        <pic:blipFill>
-                          <a:blip r:embed="rId17" cstate="none"/>
-                          <a:srcRect/>
-                          <a:stretch>
-                            <a:fillRect/>
-                          </a:stretch>
-                        </pic:blipFill>
-                        <pic:spPr bwMode="auto">
-                          <a:xfrm>
-                            <a:off x="0" y="0"/>
-                            <a:ext cx="247650" cy="247650"/>
-                          </a:xfrm>
-                          <a:prstGeom prst="rect">
-                            <a:avLst/>
-                          </a:prstGeom>
-                        </pic:spPr>
-                      </pic:pic>
-                    </a:graphicData>
-                  </a:graphic>
-                </wp:inline>
-              </w:drawing>
-            </w:r>
+            </w:pPr>
           </w:p>
         </w:tc>
         <w:tc>
@@ -507,48 +220,7 @@
           <w:p>
             <w:pPr>
               <w:spacing w:after="0" w:before="0"/>
-              <w:jc w:val="center"/>
-            </w:pPr>
-            <w:r>
-              <w:drawing>
-                <wp:inline distT="0" distB="0" distL="0" distR="0">
-                  <wp:extent cx="247650" cy="247650"/>
-                  <wp:effectExtent t="0" r="0" b="0" l="0"/>
-                  <wp:docPr id="1" name="" descr="" title=""/>
-                  <wp:cNvGraphicFramePr>
-                    <a:graphicFrameLocks xmlns:a="http://schemas.openxmlformats.org/drawingml/2006/main" noChangeAspect="1"/>
-                  </wp:cNvGraphicFramePr>
-                  <a:graphic xmlns:a="http://schemas.openxmlformats.org/drawingml/2006/main">
-                    <a:graphicData uri="http://schemas.openxmlformats.org/drawingml/2006/picture">
-                      <pic:pic xmlns:pic="http://schemas.openxmlformats.org/drawingml/2006/picture">
-                        <pic:nvPicPr>
-                          <pic:cNvPr id="0" name="" descr=""/>
-                          <pic:cNvPicPr>
-                            <a:picLocks noChangeAspect="1" noChangeArrowheads="1"/>
-                          </pic:cNvPicPr>
-                        </pic:nvPicPr>
-                        <pic:blipFill>
-                          <a:blip r:embed="rId18" cstate="none"/>
-                          <a:srcRect/>
-                          <a:stretch>
-                            <a:fillRect/>
-                          </a:stretch>
-                        </pic:blipFill>
-                        <pic:spPr bwMode="auto">
-                          <a:xfrm>
-                            <a:off x="0" y="0"/>
-                            <a:ext cx="247650" cy="247650"/>
-                          </a:xfrm>
-                          <a:prstGeom prst="rect">
-                            <a:avLst/>
-                          </a:prstGeom>
-                        </pic:spPr>
-                      </pic:pic>
-                    </a:graphicData>
-                  </a:graphic>
-                </wp:inline>
-              </w:drawing>
-            </w:r>
+            </w:pPr>
           </w:p>
         </w:tc>
         <w:tc>
@@ -572,48 +244,7 @@
           <w:p>
             <w:pPr>
               <w:spacing w:after="0" w:before="0"/>
-              <w:jc w:val="center"/>
-            </w:pPr>
-            <w:r>
-              <w:drawing>
-                <wp:inline distT="0" distB="0" distL="0" distR="0">
-                  <wp:extent cx="247650" cy="247650"/>
-                  <wp:effectExtent t="0" r="0" b="0" l="0"/>
-                  <wp:docPr id="1" name="" descr="" title=""/>
-                  <wp:cNvGraphicFramePr>
-                    <a:graphicFrameLocks xmlns:a="http://schemas.openxmlformats.org/drawingml/2006/main" noChangeAspect="1"/>
-                  </wp:cNvGraphicFramePr>
-                  <a:graphic xmlns:a="http://schemas.openxmlformats.org/drawingml/2006/main">
-                    <a:graphicData uri="http://schemas.openxmlformats.org/drawingml/2006/picture">
-                      <pic:pic xmlns:pic="http://schemas.openxmlformats.org/drawingml/2006/picture">
-                        <pic:nvPicPr>
-                          <pic:cNvPr id="0" name="" descr=""/>
-                          <pic:cNvPicPr>
-                            <a:picLocks noChangeAspect="1" noChangeArrowheads="1"/>
-                          </pic:cNvPicPr>
-                        </pic:nvPicPr>
-                        <pic:blipFill>
-                          <a:blip r:embed="rId19" cstate="none"/>
-                          <a:srcRect/>
-                          <a:stretch>
-                            <a:fillRect/>
-                          </a:stretch>
-                        </pic:blipFill>
-                        <pic:spPr bwMode="auto">
-                          <a:xfrm>
-                            <a:off x="0" y="0"/>
-                            <a:ext cx="247650" cy="247650"/>
-                          </a:xfrm>
-                          <a:prstGeom prst="rect">
-                            <a:avLst/>
-                          </a:prstGeom>
-                        </pic:spPr>
-                      </pic:pic>
-                    </a:graphicData>
-                  </a:graphic>
-                </wp:inline>
-              </w:drawing>
-            </w:r>
+            </w:pPr>
           </w:p>
         </w:tc>
       </w:tr>
@@ -2276,7 +1907,7 @@
                           </pic:cNvPicPr>
                         </pic:nvPicPr>
                         <pic:blipFill>
-                          <a:blip r:embed="rId20" cstate="none"/>
+                          <a:blip r:embed="rId13" cstate="none"/>
                           <a:srcRect/>
                           <a:stretch>
                             <a:fillRect/>
@@ -2419,7 +2050,7 @@
                           </pic:cNvPicPr>
                         </pic:nvPicPr>
                         <pic:blipFill>
-                          <a:blip r:embed="rId21" cstate="none"/>
+                          <a:blip r:embed="rId14" cstate="none"/>
                           <a:srcRect/>
                           <a:stretch>
                             <a:fillRect/>
@@ -2592,7 +2223,7 @@
                           </pic:cNvPicPr>
                         </pic:nvPicPr>
                         <pic:blipFill>
-                          <a:blip r:embed="rId22" cstate="none"/>
+                          <a:blip r:embed="rId15" cstate="none"/>
                           <a:srcRect/>
                           <a:stretch>
                             <a:fillRect/>
@@ -2770,7 +2401,7 @@
                           </pic:cNvPicPr>
                         </pic:nvPicPr>
                         <pic:blipFill>
-                          <a:blip r:embed="rId23" cstate="none"/>
+                          <a:blip r:embed="rId16" cstate="none"/>
                           <a:srcRect/>
                           <a:stretch>
                             <a:fillRect/>
@@ -2951,7 +2582,7 @@
                           </pic:cNvPicPr>
                         </pic:nvPicPr>
                         <pic:blipFill>
-                          <a:blip r:embed="rId24" cstate="none"/>
+                          <a:blip r:embed="rId17" cstate="none"/>
                           <a:srcRect/>
                           <a:stretch>
                             <a:fillRect/>
@@ -3132,7 +2763,7 @@
                           </pic:cNvPicPr>
                         </pic:nvPicPr>
                         <pic:blipFill>
-                          <a:blip r:embed="rId25" cstate="none"/>
+                          <a:blip r:embed="rId18" cstate="none"/>
                           <a:srcRect/>
                           <a:stretch>
                             <a:fillRect/>
@@ -3293,7 +2924,7 @@
                           </pic:cNvPicPr>
                         </pic:nvPicPr>
                         <pic:blipFill>
-                          <a:blip r:embed="rId26" cstate="none"/>
+                          <a:blip r:embed="rId19" cstate="none"/>
                           <a:srcRect/>
                           <a:stretch>
                             <a:fillRect/>
@@ -4302,7 +3933,7 @@
                           </pic:cNvPicPr>
                         </pic:nvPicPr>
                         <pic:blipFill>
-                          <a:blip r:embed="rId23" cstate="none"/>
+                          <a:blip r:embed="rId16" cstate="none"/>
                           <a:srcRect/>
                           <a:stretch>
                             <a:fillRect/>
@@ -4457,7 +4088,7 @@
                           </pic:cNvPicPr>
                         </pic:nvPicPr>
                         <pic:blipFill>
-                          <a:blip r:embed="rId24" cstate="none"/>
+                          <a:blip r:embed="rId17" cstate="none"/>
                           <a:srcRect/>
                           <a:stretch>
                             <a:fillRect/>
@@ -4612,7 +4243,7 @@
                           </pic:cNvPicPr>
                         </pic:nvPicPr>
                         <pic:blipFill>
-                          <a:blip r:embed="rId25" cstate="none"/>
+                          <a:blip r:embed="rId18" cstate="none"/>
                           <a:srcRect/>
                           <a:stretch>
                             <a:fillRect/>
@@ -5130,7 +4761,7 @@
                           </pic:cNvPicPr>
                         </pic:nvPicPr>
                         <pic:blipFill>
-                          <a:blip r:embed="rId26" cstate="none"/>
+                          <a:blip r:embed="rId19" cstate="none"/>
                           <a:srcRect/>
                           <a:stretch>
                             <a:fillRect/>

</xml_diff>

<commit_message>
Objectives: remove the visible Bloom level labels
The "Objetivos" box no longer shows a level label next to each objective,
on screen, in print or in the Word template. The level stays in the
markup as data-level, so AlignmentTable and the HTML checker still check
each objective's verb against its level. In Word, where no level is
written, the checker now warns when an objective does not start with a
verb from the revised Bloom taxonomy. Activities keep their labels.

Co-Authored-By: Claude Opus 5.5 <noreply@anthropic.com>
</commit_message>
<xml_diff>
--- a/didactica-design-system/templates/Didactica-Universitaria-muestra.docx
+++ b/didactica-design-system/templates/Didactica-Universitaria-muestra.docx
@@ -1761,18 +1761,6 @@
               <w:t xml:space="preserve">O1</w:t>
             </w:r>
             <w:r>
-              <w:t xml:space="preserve">   </w:t>
-            </w:r>
-            <w:r>
-              <w:rPr>
-                <w:rFonts w:ascii="Calibri" w:cs="Calibri" w:eastAsia="Calibri" w:hAnsi="Calibri"/>
-                <w:b/>
-                <w:bCs/>
-                <w:color w:val="0D5C63"/>
-              </w:rPr>
-              <w:t xml:space="preserve">2 · COMPRENDER</w:t>
-            </w:r>
-            <w:r>
               <w:t xml:space="preserve">   [Explicar …]</w:t>
             </w:r>
           </w:p>
@@ -1791,18 +1779,6 @@
               <w:t xml:space="preserve">O2</w:t>
             </w:r>
             <w:r>
-              <w:t xml:space="preserve">   </w:t>
-            </w:r>
-            <w:r>
-              <w:rPr>
-                <w:rFonts w:ascii="Calibri" w:cs="Calibri" w:eastAsia="Calibri" w:hAnsi="Calibri"/>
-                <w:b/>
-                <w:bCs/>
-                <w:color w:val="0D5C63"/>
-              </w:rPr>
-              <w:t xml:space="preserve">4 · ANALIZAR</w:t>
-            </w:r>
-            <w:r>
               <w:t xml:space="preserve">   [Comparar …]</w:t>
             </w:r>
           </w:p>
@@ -1819,18 +1795,6 @@
                 <w:color w:val="0D5C63"/>
               </w:rPr>
               <w:t xml:space="preserve">O3</w:t>
-            </w:r>
-            <w:r>
-              <w:t xml:space="preserve">   </w:t>
-            </w:r>
-            <w:r>
-              <w:rPr>
-                <w:rFonts w:ascii="Calibri" w:cs="Calibri" w:eastAsia="Calibri" w:hAnsi="Calibri"/>
-                <w:b/>
-                <w:bCs/>
-                <w:color w:val="0D5C63"/>
-              </w:rPr>
-              <w:t xml:space="preserve">6 · CREAR</w:t>
             </w:r>
             <w:r>
               <w:t xml:space="preserve">   [Diseñar …]</w:t>
@@ -3364,18 +3328,6 @@
               <w:t xml:space="preserve">O1</w:t>
             </w:r>
             <w:r>
-              <w:t xml:space="preserve">   </w:t>
-            </w:r>
-            <w:r>
-              <w:rPr>
-                <w:rFonts w:ascii="Calibri" w:cs="Calibri" w:eastAsia="Calibri" w:hAnsi="Calibri"/>
-                <w:b/>
-                <w:bCs/>
-                <w:color w:val="0D5C63"/>
-              </w:rPr>
-              <w:t xml:space="preserve">2 · COMPRENDER</w:t>
-            </w:r>
-            <w:r>
               <w:t xml:space="preserve">   [Explicar …]</w:t>
             </w:r>
           </w:p>
@@ -3392,18 +3344,6 @@
                 <w:color w:val="0D5C63"/>
               </w:rPr>
               <w:t xml:space="preserve">O2</w:t>
-            </w:r>
-            <w:r>
-              <w:t xml:space="preserve">   </w:t>
-            </w:r>
-            <w:r>
-              <w:rPr>
-                <w:rFonts w:ascii="Calibri" w:cs="Calibri" w:eastAsia="Calibri" w:hAnsi="Calibri"/>
-                <w:b/>
-                <w:bCs/>
-                <w:color w:val="0D5C63"/>
-              </w:rPr>
-              <w:t xml:space="preserve">4 · ANALIZAR</w:t>
             </w:r>
             <w:r>
               <w:t xml:space="preserve">   [Comparar …]</w:t>

</xml_diff>

<commit_message>
Activities: remove the visible Bloom level labels
Each activity now shows only its type and the objectives it practises,
on screen, in print and in the Word template. The level stays in the
markup as data-level, so AlignmentTable still checks it. The unused
LevelTag helper and bloomLevel import are removed.

Co-Authored-By: Claude Opus 5.5 <noreply@anthropic.com>
</commit_message>
<xml_diff>
--- a/didactica-design-system/templates/Didactica-Universitaria-muestra.docx
+++ b/didactica-design-system/templates/Didactica-Universitaria-muestra.docx
@@ -2790,7 +2790,7 @@
                 <w:bCs/>
                 <w:color w:val="2D6A2E"/>
               </w:rPr>
-              <w:t xml:space="preserve">TAREA · 4 · ANALIZAR · O2</w:t>
+              <w:t xml:space="preserve">TAREA · O2</w:t>
             </w:r>
             <w:r>
               <w:t xml:space="preserve">  [Consigna en modo imperativo de usted.]</w:t>
@@ -2812,7 +2812,7 @@
                 <w:bCs/>
                 <w:color w:val="2D6A2E"/>
               </w:rPr>
-              <w:t xml:space="preserve">PREGUNTA · 2 · COMPRENDER · O1</w:t>
+              <w:t xml:space="preserve">PREGUNTA · O1</w:t>
             </w:r>
             <w:r>
               <w:t xml:space="preserve">  [Pregunta.]</w:t>
@@ -4246,7 +4246,7 @@
                 <w:bCs/>
                 <w:color w:val="2D6A2E"/>
               </w:rPr>
-              <w:t xml:space="preserve">TAREA · 4 · ANALIZAR · O2</w:t>
+              <w:t xml:space="preserve">TAREA · O2</w:t>
             </w:r>
             <w:r>
               <w:t xml:space="preserve">  [Consigna.]</w:t>

</xml_diff>

<commit_message>
Alignment table: remove the "Nivel" column
The table now shows Objetivo, Actividades and Estado, in HTML and in the
Word template. Levels are still checked: when an activity is pitched
below its objective, the Estado message names both levels.

Co-Authored-By: Claude Opus 5.5 <noreply@anthropic.com>
</commit_message>
<xml_diff>
--- a/didactica-design-system/templates/Didactica-Universitaria-muestra.docx
+++ b/didactica-design-system/templates/Didactica-Universitaria-muestra.docx
@@ -4295,10 +4295,9 @@
         <w:tblLayout w:type="fixed"/>
       </w:tblPr>
       <w:tblGrid>
-        <w:gridCol w:w="1264"/>
-        <w:gridCol w:w="1986"/>
-        <w:gridCol w:w="2166"/>
-        <w:gridCol w:w="3610"/>
+        <w:gridCol w:w="1444"/>
+        <w:gridCol w:w="2527"/>
+        <w:gridCol w:w="5055"/>
       </w:tblGrid>
       <w:tr>
         <w:trPr>
@@ -4306,7 +4305,7 @@
         </w:trPr>
         <w:tc>
           <w:tcPr>
-            <w:tcW w:type="dxa" w:w="1264"/>
+            <w:tcW w:type="dxa" w:w="1444"/>
             <w:tcBorders>
               <w:top w:val="single" w:color="6F7F99" w:sz="12"/>
               <w:left w:val="none" w:color="FFFFFF" w:sz="0"/>
@@ -4332,7 +4331,7 @@
         </w:tc>
         <w:tc>
           <w:tcPr>
-            <w:tcW w:type="dxa" w:w="1986"/>
+            <w:tcW w:type="dxa" w:w="2527"/>
             <w:tcBorders>
               <w:top w:val="single" w:color="6F7F99" w:sz="12"/>
               <w:left w:val="none" w:color="FFFFFF" w:sz="0"/>
@@ -4352,39 +4351,13 @@
               <w:pStyle w:val="CeldaEncabezado"/>
             </w:pPr>
             <w:r>
-              <w:t xml:space="preserve">Nivel</w:t>
-            </w:r>
-          </w:p>
-        </w:tc>
-        <w:tc>
-          <w:tcPr>
-            <w:tcW w:type="dxa" w:w="2166"/>
-            <w:tcBorders>
-              <w:top w:val="single" w:color="6F7F99" w:sz="12"/>
-              <w:left w:val="none" w:color="FFFFFF" w:sz="0"/>
-              <w:bottom w:val="single" w:color="6F7F99" w:sz="12"/>
-              <w:right w:val="none" w:color="FFFFFF" w:sz="0"/>
-            </w:tcBorders>
-            <w:shd w:fill="C8D4EA" w:color="auto" w:val="clear"/>
-            <w:tcMar>
-              <w:top w:type="dxa" w:w="80"/>
-              <w:left w:type="dxa" w:w="120"/>
-              <w:bottom w:type="dxa" w:w="80"/>
-              <w:right w:type="dxa" w:w="120"/>
-            </w:tcMar>
-          </w:tcPr>
-          <w:p>
-            <w:pPr>
-              <w:pStyle w:val="CeldaEncabezado"/>
-            </w:pPr>
-            <w:r>
               <w:t xml:space="preserve">Actividades</w:t>
             </w:r>
           </w:p>
         </w:tc>
         <w:tc>
           <w:tcPr>
-            <w:tcW w:type="dxa" w:w="3610"/>
+            <w:tcW w:type="dxa" w:w="5055"/>
             <w:tcBorders>
               <w:top w:val="single" w:color="6F7F99" w:sz="12"/>
               <w:left w:val="none" w:color="FFFFFF" w:sz="0"/>
@@ -4415,7 +4388,7 @@
         </w:trPr>
         <w:tc>
           <w:tcPr>
-            <w:tcW w:type="dxa" w:w="1264"/>
+            <w:tcW w:type="dxa" w:w="1444"/>
             <w:tcBorders>
               <w:top w:val="none" w:color="FFFFFF" w:sz="0"/>
               <w:left w:val="none" w:color="FFFFFF" w:sz="0"/>
@@ -4440,7 +4413,7 @@
         </w:tc>
         <w:tc>
           <w:tcPr>
-            <w:tcW w:type="dxa" w:w="1986"/>
+            <w:tcW w:type="dxa" w:w="2527"/>
             <w:tcBorders>
               <w:top w:val="none" w:color="FFFFFF" w:sz="0"/>
               <w:left w:val="none" w:color="FFFFFF" w:sz="0"/>
@@ -4459,38 +4432,13 @@
               <w:pStyle w:val="CeldaTabla"/>
             </w:pPr>
             <w:r>
-              <w:t xml:space="preserve">Comprender</w:t>
-            </w:r>
-          </w:p>
-        </w:tc>
-        <w:tc>
-          <w:tcPr>
-            <w:tcW w:type="dxa" w:w="2166"/>
-            <w:tcBorders>
-              <w:top w:val="none" w:color="FFFFFF" w:sz="0"/>
-              <w:left w:val="none" w:color="FFFFFF" w:sz="0"/>
-              <w:bottom w:val="single" w:color="C3CDE0" w:sz="4"/>
-              <w:right w:val="none" w:color="FFFFFF" w:sz="0"/>
-            </w:tcBorders>
-            <w:tcMar>
-              <w:top w:type="dxa" w:w="60"/>
-              <w:left w:type="dxa" w:w="120"/>
-              <w:bottom w:type="dxa" w:w="60"/>
-              <w:right w:type="dxa" w:w="120"/>
-            </w:tcMar>
-          </w:tcPr>
-          <w:p>
-            <w:pPr>
-              <w:pStyle w:val="CeldaTabla"/>
-            </w:pPr>
-            <w:r>
               <w:t xml:space="preserve">[n.º]</w:t>
             </w:r>
           </w:p>
         </w:tc>
         <w:tc>
           <w:tcPr>
-            <w:tcW w:type="dxa" w:w="3610"/>
+            <w:tcW w:type="dxa" w:w="5055"/>
             <w:tcBorders>
               <w:top w:val="none" w:color="FFFFFF" w:sz="0"/>
               <w:left w:val="none" w:color="FFFFFF" w:sz="0"/>
@@ -4520,7 +4468,7 @@
         </w:trPr>
         <w:tc>
           <w:tcPr>
-            <w:tcW w:type="dxa" w:w="1264"/>
+            <w:tcW w:type="dxa" w:w="1444"/>
             <w:tcBorders>
               <w:top w:val="none" w:color="FFFFFF" w:sz="0"/>
               <w:left w:val="none" w:color="FFFFFF" w:sz="0"/>
@@ -4546,7 +4494,7 @@
         </w:tc>
         <w:tc>
           <w:tcPr>
-            <w:tcW w:type="dxa" w:w="1986"/>
+            <w:tcW w:type="dxa" w:w="2527"/>
             <w:tcBorders>
               <w:top w:val="none" w:color="FFFFFF" w:sz="0"/>
               <w:left w:val="none" w:color="FFFFFF" w:sz="0"/>
@@ -4566,39 +4514,13 @@
               <w:pStyle w:val="CeldaTabla"/>
             </w:pPr>
             <w:r>
-              <w:t xml:space="preserve">Analizar</w:t>
-            </w:r>
-          </w:p>
-        </w:tc>
-        <w:tc>
-          <w:tcPr>
-            <w:tcW w:type="dxa" w:w="2166"/>
-            <w:tcBorders>
-              <w:top w:val="none" w:color="FFFFFF" w:sz="0"/>
-              <w:left w:val="none" w:color="FFFFFF" w:sz="0"/>
-              <w:bottom w:val="single" w:color="6F7F99" w:sz="12"/>
-              <w:right w:val="none" w:color="FFFFFF" w:sz="0"/>
-            </w:tcBorders>
-            <w:shd w:fill="F2F5FA" w:color="auto" w:val="clear"/>
-            <w:tcMar>
-              <w:top w:type="dxa" w:w="60"/>
-              <w:left w:type="dxa" w:w="120"/>
-              <w:bottom w:type="dxa" w:w="60"/>
-              <w:right w:type="dxa" w:w="120"/>
-            </w:tcMar>
-          </w:tcPr>
-          <w:p>
-            <w:pPr>
-              <w:pStyle w:val="CeldaTabla"/>
-            </w:pPr>
-            <w:r>
               <w:t xml:space="preserve">[n.º]</w:t>
             </w:r>
           </w:p>
         </w:tc>
         <w:tc>
           <w:tcPr>
-            <w:tcW w:type="dxa" w:w="3610"/>
+            <w:tcW w:type="dxa" w:w="5055"/>
             <w:tcBorders>
               <w:top w:val="none" w:color="FFFFFF" w:sz="0"/>
               <w:left w:val="none" w:color="FFFFFF" w:sz="0"/>

</xml_diff>

<commit_message>
Restore the alignment table's "Nivel" column
Reverts ef85d1b: the AlignmentTable change was not wanted. The table
again shows Objetivo, Nivel, Actividades and Estado, in HTML and Word.
Objectives and Activities keep their labels removed.

Co-Authored-By: Claude Opus 5.5 <noreply@anthropic.com>
</commit_message>
<xml_diff>
--- a/didactica-design-system/templates/Didactica-Universitaria-muestra.docx
+++ b/didactica-design-system/templates/Didactica-Universitaria-muestra.docx
@@ -4295,9 +4295,10 @@
         <w:tblLayout w:type="fixed"/>
       </w:tblPr>
       <w:tblGrid>
-        <w:gridCol w:w="1444"/>
-        <w:gridCol w:w="2527"/>
-        <w:gridCol w:w="5055"/>
+        <w:gridCol w:w="1264"/>
+        <w:gridCol w:w="1986"/>
+        <w:gridCol w:w="2166"/>
+        <w:gridCol w:w="3610"/>
       </w:tblGrid>
       <w:tr>
         <w:trPr>
@@ -4305,7 +4306,7 @@
         </w:trPr>
         <w:tc>
           <w:tcPr>
-            <w:tcW w:type="dxa" w:w="1444"/>
+            <w:tcW w:type="dxa" w:w="1264"/>
             <w:tcBorders>
               <w:top w:val="single" w:color="6F7F99" w:sz="12"/>
               <w:left w:val="none" w:color="FFFFFF" w:sz="0"/>
@@ -4331,7 +4332,7 @@
         </w:tc>
         <w:tc>
           <w:tcPr>
-            <w:tcW w:type="dxa" w:w="2527"/>
+            <w:tcW w:type="dxa" w:w="1986"/>
             <w:tcBorders>
               <w:top w:val="single" w:color="6F7F99" w:sz="12"/>
               <w:left w:val="none" w:color="FFFFFF" w:sz="0"/>
@@ -4351,13 +4352,39 @@
               <w:pStyle w:val="CeldaEncabezado"/>
             </w:pPr>
             <w:r>
+              <w:t xml:space="preserve">Nivel</w:t>
+            </w:r>
+          </w:p>
+        </w:tc>
+        <w:tc>
+          <w:tcPr>
+            <w:tcW w:type="dxa" w:w="2166"/>
+            <w:tcBorders>
+              <w:top w:val="single" w:color="6F7F99" w:sz="12"/>
+              <w:left w:val="none" w:color="FFFFFF" w:sz="0"/>
+              <w:bottom w:val="single" w:color="6F7F99" w:sz="12"/>
+              <w:right w:val="none" w:color="FFFFFF" w:sz="0"/>
+            </w:tcBorders>
+            <w:shd w:fill="C8D4EA" w:color="auto" w:val="clear"/>
+            <w:tcMar>
+              <w:top w:type="dxa" w:w="80"/>
+              <w:left w:type="dxa" w:w="120"/>
+              <w:bottom w:type="dxa" w:w="80"/>
+              <w:right w:type="dxa" w:w="120"/>
+            </w:tcMar>
+          </w:tcPr>
+          <w:p>
+            <w:pPr>
+              <w:pStyle w:val="CeldaEncabezado"/>
+            </w:pPr>
+            <w:r>
               <w:t xml:space="preserve">Actividades</w:t>
             </w:r>
           </w:p>
         </w:tc>
         <w:tc>
           <w:tcPr>
-            <w:tcW w:type="dxa" w:w="5055"/>
+            <w:tcW w:type="dxa" w:w="3610"/>
             <w:tcBorders>
               <w:top w:val="single" w:color="6F7F99" w:sz="12"/>
               <w:left w:val="none" w:color="FFFFFF" w:sz="0"/>
@@ -4388,7 +4415,7 @@
         </w:trPr>
         <w:tc>
           <w:tcPr>
-            <w:tcW w:type="dxa" w:w="1444"/>
+            <w:tcW w:type="dxa" w:w="1264"/>
             <w:tcBorders>
               <w:top w:val="none" w:color="FFFFFF" w:sz="0"/>
               <w:left w:val="none" w:color="FFFFFF" w:sz="0"/>
@@ -4413,7 +4440,7 @@
         </w:tc>
         <w:tc>
           <w:tcPr>
-            <w:tcW w:type="dxa" w:w="2527"/>
+            <w:tcW w:type="dxa" w:w="1986"/>
             <w:tcBorders>
               <w:top w:val="none" w:color="FFFFFF" w:sz="0"/>
               <w:left w:val="none" w:color="FFFFFF" w:sz="0"/>
@@ -4432,13 +4459,38 @@
               <w:pStyle w:val="CeldaTabla"/>
             </w:pPr>
             <w:r>
+              <w:t xml:space="preserve">Comprender</w:t>
+            </w:r>
+          </w:p>
+        </w:tc>
+        <w:tc>
+          <w:tcPr>
+            <w:tcW w:type="dxa" w:w="2166"/>
+            <w:tcBorders>
+              <w:top w:val="none" w:color="FFFFFF" w:sz="0"/>
+              <w:left w:val="none" w:color="FFFFFF" w:sz="0"/>
+              <w:bottom w:val="single" w:color="C3CDE0" w:sz="4"/>
+              <w:right w:val="none" w:color="FFFFFF" w:sz="0"/>
+            </w:tcBorders>
+            <w:tcMar>
+              <w:top w:type="dxa" w:w="60"/>
+              <w:left w:type="dxa" w:w="120"/>
+              <w:bottom w:type="dxa" w:w="60"/>
+              <w:right w:type="dxa" w:w="120"/>
+            </w:tcMar>
+          </w:tcPr>
+          <w:p>
+            <w:pPr>
+              <w:pStyle w:val="CeldaTabla"/>
+            </w:pPr>
+            <w:r>
               <w:t xml:space="preserve">[n.º]</w:t>
             </w:r>
           </w:p>
         </w:tc>
         <w:tc>
           <w:tcPr>
-            <w:tcW w:type="dxa" w:w="5055"/>
+            <w:tcW w:type="dxa" w:w="3610"/>
             <w:tcBorders>
               <w:top w:val="none" w:color="FFFFFF" w:sz="0"/>
               <w:left w:val="none" w:color="FFFFFF" w:sz="0"/>
@@ -4468,7 +4520,7 @@
         </w:trPr>
         <w:tc>
           <w:tcPr>
-            <w:tcW w:type="dxa" w:w="1444"/>
+            <w:tcW w:type="dxa" w:w="1264"/>
             <w:tcBorders>
               <w:top w:val="none" w:color="FFFFFF" w:sz="0"/>
               <w:left w:val="none" w:color="FFFFFF" w:sz="0"/>
@@ -4494,7 +4546,7 @@
         </w:tc>
         <w:tc>
           <w:tcPr>
-            <w:tcW w:type="dxa" w:w="2527"/>
+            <w:tcW w:type="dxa" w:w="1986"/>
             <w:tcBorders>
               <w:top w:val="none" w:color="FFFFFF" w:sz="0"/>
               <w:left w:val="none" w:color="FFFFFF" w:sz="0"/>
@@ -4514,13 +4566,39 @@
               <w:pStyle w:val="CeldaTabla"/>
             </w:pPr>
             <w:r>
+              <w:t xml:space="preserve">Analizar</w:t>
+            </w:r>
+          </w:p>
+        </w:tc>
+        <w:tc>
+          <w:tcPr>
+            <w:tcW w:type="dxa" w:w="2166"/>
+            <w:tcBorders>
+              <w:top w:val="none" w:color="FFFFFF" w:sz="0"/>
+              <w:left w:val="none" w:color="FFFFFF" w:sz="0"/>
+              <w:bottom w:val="single" w:color="6F7F99" w:sz="12"/>
+              <w:right w:val="none" w:color="FFFFFF" w:sz="0"/>
+            </w:tcBorders>
+            <w:shd w:fill="F2F5FA" w:color="auto" w:val="clear"/>
+            <w:tcMar>
+              <w:top w:type="dxa" w:w="60"/>
+              <w:left w:type="dxa" w:w="120"/>
+              <w:bottom w:type="dxa" w:w="60"/>
+              <w:right w:type="dxa" w:w="120"/>
+            </w:tcMar>
+          </w:tcPr>
+          <w:p>
+            <w:pPr>
+              <w:pStyle w:val="CeldaTabla"/>
+            </w:pPr>
+            <w:r>
               <w:t xml:space="preserve">[n.º]</w:t>
             </w:r>
           </w:p>
         </w:tc>
         <w:tc>
           <w:tcPr>
-            <w:tcW w:type="dxa" w:w="5055"/>
+            <w:tcW w:type="dxa" w:w="3610"/>
             <w:tcBorders>
               <w:top w:val="none" w:color="FFFFFF" w:sz="0"/>
               <w:left w:val="none" w:color="FFFFFF" w:sz="0"/>

</xml_diff>

<commit_message>
Activities: remove the objective tags (O1, O2…)
Each activity now shows only its type tag, on screen, in print and in the
Word template. The objectives it practises stay in data-objectives and
still feed AlignmentTable. The unused du-tag--link styles are removed.

Co-Authored-By: Claude Opus 5.5 <noreply@anthropic.com>
</commit_message>
<xml_diff>
--- a/didactica-design-system/templates/Didactica-Universitaria-muestra.docx
+++ b/didactica-design-system/templates/Didactica-Universitaria-muestra.docx
@@ -2790,7 +2790,7 @@
                 <w:bCs/>
                 <w:color w:val="2D6A2E"/>
               </w:rPr>
-              <w:t xml:space="preserve">TAREA · O2</w:t>
+              <w:t xml:space="preserve">TAREA</w:t>
             </w:r>
             <w:r>
               <w:t xml:space="preserve">  [Consigna en modo imperativo de usted.]</w:t>
@@ -2812,7 +2812,7 @@
                 <w:bCs/>
                 <w:color w:val="2D6A2E"/>
               </w:rPr>
-              <w:t xml:space="preserve">PREGUNTA · O1</w:t>
+              <w:t xml:space="preserve">PREGUNTA</w:t>
             </w:r>
             <w:r>
               <w:t xml:space="preserve">  [Pregunta.]</w:t>
@@ -4246,7 +4246,7 @@
                 <w:bCs/>
                 <w:color w:val="2D6A2E"/>
               </w:rPr>
-              <w:t xml:space="preserve">TAREA · O2</w:t>
+              <w:t xml:space="preserve">TAREA</w:t>
             </w:r>
             <w:r>
               <w:t xml:space="preserve">  [Consigna.]</w:t>

</xml_diff>